<commit_message>
Add functionality for the CountToOne recursive method.
</commit_message>
<xml_diff>
--- a/Activity3/CST-250 Activity Template.docx
+++ b/Activity3/CST-250 Activity Template.docx
@@ -72,36 +72,34 @@
           <w:sz w:val="46"/>
           <w:szCs w:val="46"/>
         </w:rPr>
-        <w:t>June 01, 2025</w:t>
-      </w:r>
-    </w:p>
-    <w:p>
-      <w:pPr>
-        <w:jc w:val="center"/>
-      </w:pPr>
+        <w:t>Nov. 09</w:t>
+      </w:r>
       <w:r>
         <w:rPr>
           <w:sz w:val="46"/>
           <w:szCs w:val="46"/>
         </w:rPr>
-        <w:t xml:space="preserve">Activity </w:t>
-      </w:r>
+        <w:t>, 2025</w:t>
+      </w:r>
+    </w:p>
+    <w:p>
+      <w:pPr>
+        <w:jc w:val="center"/>
+      </w:pPr>
       <w:r>
         <w:rPr>
           <w:sz w:val="46"/>
           <w:szCs w:val="46"/>
         </w:rPr>
-        <w:t>1</w:t>
-      </w:r>
-    </w:p>
-    <w:p>
-      <w:pPr>
-        <w:jc w:val="center"/>
+        <w:t xml:space="preserve">Activity </w:t>
+      </w:r>
+      <w:r>
         <w:rPr>
           <w:sz w:val="46"/>
           <w:szCs w:val="46"/>
         </w:rPr>
-      </w:pPr>
+        <w:t>3</w:t>
+      </w:r>
     </w:p>
     <w:p>
       <w:pPr>
@@ -111,39 +109,106 @@
           <w:szCs w:val="46"/>
         </w:rPr>
       </w:pPr>
-      <w:r>
+    </w:p>
+    <w:p>
+      <w:pPr>
+        <w:jc w:val="center"/>
         <w:rPr>
           <w:sz w:val="46"/>
           <w:szCs w:val="46"/>
         </w:rPr>
-        <w:t>Files</w:t>
-      </w:r>
-    </w:p>
-    <w:p>
-      <w:pPr>
-        <w:jc w:val="center"/>
-      </w:pPr>
-      <w:hyperlink r:id="rId5">
-        <w:r>
-          <w:rPr>
-            <w:rStyle w:val="Hyperlink"/>
-            <w:sz w:val="46"/>
-            <w:szCs w:val="46"/>
-            <w:lang w:val="en-US"/>
-          </w:rPr>
-          <w:t>https://github.com/CGalloway3/CST-150/tree/main/Activity%202</w:t>
-        </w:r>
-      </w:hyperlink>
-    </w:p>
-    <w:p>
-      <w:pPr>
-        <w:jc w:val="center"/>
+      </w:pPr>
+      <w:r>
         <w:rPr>
           <w:sz w:val="46"/>
           <w:szCs w:val="46"/>
-          <w:lang w:val="en-US"/>
-        </w:rPr>
-      </w:pPr>
+        </w:rPr>
+        <w:t>Files</w:t>
+      </w:r>
+    </w:p>
+    <w:p>
+      <w:pPr>
+        <w:jc w:val="center"/>
+        <w:rPr>
+          <w:rStyle w:val="Hyperlink"/>
+        </w:rPr>
+      </w:pPr>
+      <w:r>
+        <w:rPr>
+          <w:sz w:val="46"/>
+          <w:szCs w:val="46"/>
+          <w:lang w:val="en-US"/>
+        </w:rPr>
+        <w:fldChar w:fldCharType="begin"/>
+      </w:r>
+      <w:r>
+        <w:rPr>
+          <w:sz w:val="46"/>
+          <w:szCs w:val="46"/>
+          <w:lang w:val="en-US"/>
+        </w:rPr>
+        <w:instrText>HYPERLINK "https://github.com/CGalloway3/CST-250-Projects/tree/master/Activity3"</w:instrText>
+      </w:r>
+      <w:r>
+        <w:rPr>
+          <w:sz w:val="46"/>
+          <w:szCs w:val="46"/>
+          <w:lang w:val="en-US"/>
+        </w:rPr>
+      </w:r>
+      <w:r>
+        <w:rPr>
+          <w:sz w:val="46"/>
+          <w:szCs w:val="46"/>
+          <w:lang w:val="en-US"/>
+        </w:rPr>
+        <w:fldChar w:fldCharType="separate"/>
+      </w:r>
+      <w:r>
+        <w:rPr>
+          <w:rStyle w:val="Hyperlink"/>
+          <w:sz w:val="46"/>
+          <w:szCs w:val="46"/>
+          <w:lang w:val="en-US"/>
+        </w:rPr>
+        <w:t>https://github.com/CGalloway3/CST-250-Projects/tree/m</w:t>
+      </w:r>
+      <w:r>
+        <w:rPr>
+          <w:rStyle w:val="Hyperlink"/>
+          <w:sz w:val="46"/>
+          <w:szCs w:val="46"/>
+          <w:lang w:val="en-US"/>
+        </w:rPr>
+        <w:t>a</w:t>
+      </w:r>
+      <w:r>
+        <w:rPr>
+          <w:rStyle w:val="Hyperlink"/>
+          <w:sz w:val="46"/>
+          <w:szCs w:val="46"/>
+          <w:lang w:val="en-US"/>
+        </w:rPr>
+        <w:t>ster/Activity3</w:t>
+      </w:r>
+    </w:p>
+    <w:p>
+      <w:pPr>
+        <w:jc w:val="center"/>
+        <w:rPr>
+          <w:sz w:val="46"/>
+          <w:szCs w:val="46"/>
+          <w:lang w:val="en-US"/>
+        </w:rPr>
+      </w:pPr>
+      <w:r>
+        <w:rPr>
+          <w:sz w:val="46"/>
+          <w:szCs w:val="46"/>
+          <w:lang w:val="en-US"/>
+        </w:rPr>
+        <w:fldChar w:fldCharType="end"/>
+      </w:r>
     </w:p>
     <w:p>
       <w:pPr>
@@ -243,7 +308,7 @@
                     <pic:cNvPicPr preferRelativeResize="0"/>
                   </pic:nvPicPr>
                   <pic:blipFill>
-                    <a:blip r:embed="rId6"/>
+                    <a:blip r:embed="rId5"/>
                     <a:srcRect/>
                     <a:stretch>
                       <a:fillRect/>
@@ -284,7 +349,595 @@
         <w:rPr>
           <w:lang w:val="en-US"/>
         </w:rPr>
-        <w:t>"Lorem ipsum dolor sit amet, consectetur adipiscing elit, sed do eiusmod tempor incididunt ut labore et dolore magna aliqua. Ut enim ad minim veniam, quis nostrud exercitation ullamco laboris nisi ut aliquip ex ea commodo consequat. Duis aute irure dolor in reprehenderit in voluptate velit esse cillum dolore eu fugiat nulla pariatur. Excepteur sint occaecat cupidatat non proident, sunt in culpa qui officia deserunt mollit anim id est laborum."</w:t>
+        <w:t xml:space="preserve">"Lorem ipsum dolor sit </w:t>
+      </w:r>
+      <w:proofErr w:type="spellStart"/>
+      <w:r>
+        <w:rPr>
+          <w:lang w:val="en-US"/>
+        </w:rPr>
+        <w:t>amet</w:t>
+      </w:r>
+      <w:proofErr w:type="spellEnd"/>
+      <w:r>
+        <w:rPr>
+          <w:lang w:val="en-US"/>
+        </w:rPr>
+        <w:t xml:space="preserve">, </w:t>
+      </w:r>
+      <w:proofErr w:type="spellStart"/>
+      <w:r>
+        <w:rPr>
+          <w:lang w:val="en-US"/>
+        </w:rPr>
+        <w:t>consectetur</w:t>
+      </w:r>
+      <w:proofErr w:type="spellEnd"/>
+      <w:r>
+        <w:rPr>
+          <w:lang w:val="en-US"/>
+        </w:rPr>
+        <w:t xml:space="preserve"> </w:t>
+      </w:r>
+      <w:proofErr w:type="spellStart"/>
+      <w:r>
+        <w:rPr>
+          <w:lang w:val="en-US"/>
+        </w:rPr>
+        <w:t>adipiscing</w:t>
+      </w:r>
+      <w:proofErr w:type="spellEnd"/>
+      <w:r>
+        <w:rPr>
+          <w:lang w:val="en-US"/>
+        </w:rPr>
+        <w:t xml:space="preserve"> </w:t>
+      </w:r>
+      <w:proofErr w:type="spellStart"/>
+      <w:r>
+        <w:rPr>
+          <w:lang w:val="en-US"/>
+        </w:rPr>
+        <w:t>elit</w:t>
+      </w:r>
+      <w:proofErr w:type="spellEnd"/>
+      <w:r>
+        <w:rPr>
+          <w:lang w:val="en-US"/>
+        </w:rPr>
+        <w:t xml:space="preserve">, sed do </w:t>
+      </w:r>
+      <w:proofErr w:type="spellStart"/>
+      <w:r>
+        <w:rPr>
+          <w:lang w:val="en-US"/>
+        </w:rPr>
+        <w:t>eiusmod</w:t>
+      </w:r>
+      <w:proofErr w:type="spellEnd"/>
+      <w:r>
+        <w:rPr>
+          <w:lang w:val="en-US"/>
+        </w:rPr>
+        <w:t xml:space="preserve"> </w:t>
+      </w:r>
+      <w:proofErr w:type="spellStart"/>
+      <w:r>
+        <w:rPr>
+          <w:lang w:val="en-US"/>
+        </w:rPr>
+        <w:t>tempor</w:t>
+      </w:r>
+      <w:proofErr w:type="spellEnd"/>
+      <w:r>
+        <w:rPr>
+          <w:lang w:val="en-US"/>
+        </w:rPr>
+        <w:t xml:space="preserve"> </w:t>
+      </w:r>
+      <w:proofErr w:type="spellStart"/>
+      <w:r>
+        <w:rPr>
+          <w:lang w:val="en-US"/>
+        </w:rPr>
+        <w:t>incididunt</w:t>
+      </w:r>
+      <w:proofErr w:type="spellEnd"/>
+      <w:r>
+        <w:rPr>
+          <w:lang w:val="en-US"/>
+        </w:rPr>
+        <w:t xml:space="preserve"> </w:t>
+      </w:r>
+      <w:proofErr w:type="spellStart"/>
+      <w:r>
+        <w:rPr>
+          <w:lang w:val="en-US"/>
+        </w:rPr>
+        <w:t>ut</w:t>
+      </w:r>
+      <w:proofErr w:type="spellEnd"/>
+      <w:r>
+        <w:rPr>
+          <w:lang w:val="en-US"/>
+        </w:rPr>
+        <w:t xml:space="preserve"> labore et dolore magna </w:t>
+      </w:r>
+      <w:proofErr w:type="spellStart"/>
+      <w:r>
+        <w:rPr>
+          <w:lang w:val="en-US"/>
+        </w:rPr>
+        <w:t>aliqua</w:t>
+      </w:r>
+      <w:proofErr w:type="spellEnd"/>
+      <w:r>
+        <w:rPr>
+          <w:lang w:val="en-US"/>
+        </w:rPr>
+        <w:t xml:space="preserve">. Ut </w:t>
+      </w:r>
+      <w:proofErr w:type="spellStart"/>
+      <w:r>
+        <w:rPr>
+          <w:lang w:val="en-US"/>
+        </w:rPr>
+        <w:t>enim</w:t>
+      </w:r>
+      <w:proofErr w:type="spellEnd"/>
+      <w:r>
+        <w:rPr>
+          <w:lang w:val="en-US"/>
+        </w:rPr>
+        <w:t xml:space="preserve"> ad minim </w:t>
+      </w:r>
+      <w:proofErr w:type="spellStart"/>
+      <w:r>
+        <w:rPr>
+          <w:lang w:val="en-US"/>
+        </w:rPr>
+        <w:t>veniam</w:t>
+      </w:r>
+      <w:proofErr w:type="spellEnd"/>
+      <w:r>
+        <w:rPr>
+          <w:lang w:val="en-US"/>
+        </w:rPr>
+        <w:t xml:space="preserve">, </w:t>
+      </w:r>
+      <w:proofErr w:type="spellStart"/>
+      <w:r>
+        <w:rPr>
+          <w:lang w:val="en-US"/>
+        </w:rPr>
+        <w:t>quis</w:t>
+      </w:r>
+      <w:proofErr w:type="spellEnd"/>
+      <w:r>
+        <w:rPr>
+          <w:lang w:val="en-US"/>
+        </w:rPr>
+        <w:t xml:space="preserve"> </w:t>
+      </w:r>
+      <w:proofErr w:type="spellStart"/>
+      <w:r>
+        <w:rPr>
+          <w:lang w:val="en-US"/>
+        </w:rPr>
+        <w:t>nostrud</w:t>
+      </w:r>
+      <w:proofErr w:type="spellEnd"/>
+      <w:r>
+        <w:rPr>
+          <w:lang w:val="en-US"/>
+        </w:rPr>
+        <w:t xml:space="preserve"> exercitation </w:t>
+      </w:r>
+      <w:proofErr w:type="spellStart"/>
+      <w:r>
+        <w:rPr>
+          <w:lang w:val="en-US"/>
+        </w:rPr>
+        <w:t>ullamco</w:t>
+      </w:r>
+      <w:proofErr w:type="spellEnd"/>
+      <w:r>
+        <w:rPr>
+          <w:lang w:val="en-US"/>
+        </w:rPr>
+        <w:t xml:space="preserve"> </w:t>
+      </w:r>
+      <w:proofErr w:type="spellStart"/>
+      <w:r>
+        <w:rPr>
+          <w:lang w:val="en-US"/>
+        </w:rPr>
+        <w:t>laboris</w:t>
+      </w:r>
+      <w:proofErr w:type="spellEnd"/>
+      <w:r>
+        <w:rPr>
+          <w:lang w:val="en-US"/>
+        </w:rPr>
+        <w:t xml:space="preserve"> nisi </w:t>
+      </w:r>
+      <w:proofErr w:type="spellStart"/>
+      <w:r>
+        <w:rPr>
+          <w:lang w:val="en-US"/>
+        </w:rPr>
+        <w:t>ut</w:t>
+      </w:r>
+      <w:proofErr w:type="spellEnd"/>
+      <w:r>
+        <w:rPr>
+          <w:lang w:val="en-US"/>
+        </w:rPr>
+        <w:t xml:space="preserve"> </w:t>
+      </w:r>
+      <w:proofErr w:type="spellStart"/>
+      <w:r>
+        <w:rPr>
+          <w:lang w:val="en-US"/>
+        </w:rPr>
+        <w:t>aliquip</w:t>
+      </w:r>
+      <w:proofErr w:type="spellEnd"/>
+      <w:r>
+        <w:rPr>
+          <w:lang w:val="en-US"/>
+        </w:rPr>
+        <w:t xml:space="preserve"> ex </w:t>
+      </w:r>
+      <w:proofErr w:type="spellStart"/>
+      <w:r>
+        <w:rPr>
+          <w:lang w:val="en-US"/>
+        </w:rPr>
+        <w:t>ea</w:t>
+      </w:r>
+      <w:proofErr w:type="spellEnd"/>
+      <w:r>
+        <w:rPr>
+          <w:lang w:val="en-US"/>
+        </w:rPr>
+        <w:t xml:space="preserve"> </w:t>
+      </w:r>
+      <w:proofErr w:type="spellStart"/>
+      <w:r>
+        <w:rPr>
+          <w:lang w:val="en-US"/>
+        </w:rPr>
+        <w:t>commodo</w:t>
+      </w:r>
+      <w:proofErr w:type="spellEnd"/>
+      <w:r>
+        <w:rPr>
+          <w:lang w:val="en-US"/>
+        </w:rPr>
+        <w:t xml:space="preserve"> </w:t>
+      </w:r>
+      <w:proofErr w:type="spellStart"/>
+      <w:r>
+        <w:rPr>
+          <w:lang w:val="en-US"/>
+        </w:rPr>
+        <w:t>consequat</w:t>
+      </w:r>
+      <w:proofErr w:type="spellEnd"/>
+      <w:r>
+        <w:rPr>
+          <w:lang w:val="en-US"/>
+        </w:rPr>
+        <w:t xml:space="preserve">. Duis </w:t>
+      </w:r>
+      <w:proofErr w:type="spellStart"/>
+      <w:r>
+        <w:rPr>
+          <w:lang w:val="en-US"/>
+        </w:rPr>
+        <w:t>aute</w:t>
+      </w:r>
+      <w:proofErr w:type="spellEnd"/>
+      <w:r>
+        <w:rPr>
+          <w:lang w:val="en-US"/>
+        </w:rPr>
+        <w:t xml:space="preserve"> </w:t>
+      </w:r>
+      <w:proofErr w:type="spellStart"/>
+      <w:r>
+        <w:rPr>
+          <w:lang w:val="en-US"/>
+        </w:rPr>
+        <w:t>irure</w:t>
+      </w:r>
+      <w:proofErr w:type="spellEnd"/>
+      <w:r>
+        <w:rPr>
+          <w:lang w:val="en-US"/>
+        </w:rPr>
+        <w:t xml:space="preserve"> dolor in </w:t>
+      </w:r>
+      <w:proofErr w:type="spellStart"/>
+      <w:r>
+        <w:rPr>
+          <w:lang w:val="en-US"/>
+        </w:rPr>
+        <w:t>reprehenderit</w:t>
+      </w:r>
+      <w:proofErr w:type="spellEnd"/>
+      <w:r>
+        <w:rPr>
+          <w:lang w:val="en-US"/>
+        </w:rPr>
+        <w:t xml:space="preserve"> in </w:t>
+      </w:r>
+      <w:proofErr w:type="spellStart"/>
+      <w:r>
+        <w:rPr>
+          <w:lang w:val="en-US"/>
+        </w:rPr>
+        <w:t>voluptate</w:t>
+      </w:r>
+      <w:proofErr w:type="spellEnd"/>
+      <w:r>
+        <w:rPr>
+          <w:lang w:val="en-US"/>
+        </w:rPr>
+        <w:t xml:space="preserve"> </w:t>
+      </w:r>
+      <w:proofErr w:type="spellStart"/>
+      <w:r>
+        <w:rPr>
+          <w:lang w:val="en-US"/>
+        </w:rPr>
+        <w:t>velit</w:t>
+      </w:r>
+      <w:proofErr w:type="spellEnd"/>
+      <w:r>
+        <w:rPr>
+          <w:lang w:val="en-US"/>
+        </w:rPr>
+        <w:t xml:space="preserve"> </w:t>
+      </w:r>
+      <w:proofErr w:type="spellStart"/>
+      <w:r>
+        <w:rPr>
+          <w:lang w:val="en-US"/>
+        </w:rPr>
+        <w:t>esse</w:t>
+      </w:r>
+      <w:proofErr w:type="spellEnd"/>
+      <w:r>
+        <w:rPr>
+          <w:lang w:val="en-US"/>
+        </w:rPr>
+        <w:t xml:space="preserve"> </w:t>
+      </w:r>
+      <w:proofErr w:type="spellStart"/>
+      <w:r>
+        <w:rPr>
+          <w:lang w:val="en-US"/>
+        </w:rPr>
+        <w:t>cillum</w:t>
+      </w:r>
+      <w:proofErr w:type="spellEnd"/>
+      <w:r>
+        <w:rPr>
+          <w:lang w:val="en-US"/>
+        </w:rPr>
+        <w:t xml:space="preserve"> dolore </w:t>
+      </w:r>
+      <w:proofErr w:type="spellStart"/>
+      <w:r>
+        <w:rPr>
+          <w:lang w:val="en-US"/>
+        </w:rPr>
+        <w:t>eu</w:t>
+      </w:r>
+      <w:proofErr w:type="spellEnd"/>
+      <w:r>
+        <w:rPr>
+          <w:lang w:val="en-US"/>
+        </w:rPr>
+        <w:t xml:space="preserve"> </w:t>
+      </w:r>
+      <w:proofErr w:type="spellStart"/>
+      <w:r>
+        <w:rPr>
+          <w:lang w:val="en-US"/>
+        </w:rPr>
+        <w:t>fugiat</w:t>
+      </w:r>
+      <w:proofErr w:type="spellEnd"/>
+      <w:r>
+        <w:rPr>
+          <w:lang w:val="en-US"/>
+        </w:rPr>
+        <w:t xml:space="preserve"> </w:t>
+      </w:r>
+      <w:proofErr w:type="spellStart"/>
+      <w:r>
+        <w:rPr>
+          <w:lang w:val="en-US"/>
+        </w:rPr>
+        <w:t>nulla</w:t>
+      </w:r>
+      <w:proofErr w:type="spellEnd"/>
+      <w:r>
+        <w:rPr>
+          <w:lang w:val="en-US"/>
+        </w:rPr>
+        <w:t xml:space="preserve"> </w:t>
+      </w:r>
+      <w:proofErr w:type="spellStart"/>
+      <w:r>
+        <w:rPr>
+          <w:lang w:val="en-US"/>
+        </w:rPr>
+        <w:t>pariatur</w:t>
+      </w:r>
+      <w:proofErr w:type="spellEnd"/>
+      <w:r>
+        <w:rPr>
+          <w:lang w:val="en-US"/>
+        </w:rPr>
+        <w:t xml:space="preserve">. </w:t>
+      </w:r>
+      <w:proofErr w:type="spellStart"/>
+      <w:r>
+        <w:rPr>
+          <w:lang w:val="en-US"/>
+        </w:rPr>
+        <w:t>Excepteur</w:t>
+      </w:r>
+      <w:proofErr w:type="spellEnd"/>
+      <w:r>
+        <w:rPr>
+          <w:lang w:val="en-US"/>
+        </w:rPr>
+        <w:t xml:space="preserve"> </w:t>
+      </w:r>
+      <w:proofErr w:type="spellStart"/>
+      <w:r>
+        <w:rPr>
+          <w:lang w:val="en-US"/>
+        </w:rPr>
+        <w:t>sint</w:t>
+      </w:r>
+      <w:proofErr w:type="spellEnd"/>
+      <w:r>
+        <w:rPr>
+          <w:lang w:val="en-US"/>
+        </w:rPr>
+        <w:t xml:space="preserve"> </w:t>
+      </w:r>
+      <w:proofErr w:type="spellStart"/>
+      <w:r>
+        <w:rPr>
+          <w:lang w:val="en-US"/>
+        </w:rPr>
+        <w:t>occaecat</w:t>
+      </w:r>
+      <w:proofErr w:type="spellEnd"/>
+      <w:r>
+        <w:rPr>
+          <w:lang w:val="en-US"/>
+        </w:rPr>
+        <w:t xml:space="preserve"> </w:t>
+      </w:r>
+      <w:proofErr w:type="spellStart"/>
+      <w:r>
+        <w:rPr>
+          <w:lang w:val="en-US"/>
+        </w:rPr>
+        <w:t>cupidatat</w:t>
+      </w:r>
+      <w:proofErr w:type="spellEnd"/>
+      <w:r>
+        <w:rPr>
+          <w:lang w:val="en-US"/>
+        </w:rPr>
+        <w:t xml:space="preserve"> non </w:t>
+      </w:r>
+      <w:proofErr w:type="spellStart"/>
+      <w:r>
+        <w:rPr>
+          <w:lang w:val="en-US"/>
+        </w:rPr>
+        <w:t>proident</w:t>
+      </w:r>
+      <w:proofErr w:type="spellEnd"/>
+      <w:r>
+        <w:rPr>
+          <w:lang w:val="en-US"/>
+        </w:rPr>
+        <w:t xml:space="preserve">, sunt in culpa qui </w:t>
+      </w:r>
+      <w:proofErr w:type="spellStart"/>
+      <w:r>
+        <w:rPr>
+          <w:lang w:val="en-US"/>
+        </w:rPr>
+        <w:t>officia</w:t>
+      </w:r>
+      <w:proofErr w:type="spellEnd"/>
+      <w:r>
+        <w:rPr>
+          <w:lang w:val="en-US"/>
+        </w:rPr>
+        <w:t xml:space="preserve"> </w:t>
+      </w:r>
+      <w:proofErr w:type="spellStart"/>
+      <w:r>
+        <w:rPr>
+          <w:lang w:val="en-US"/>
+        </w:rPr>
+        <w:t>deserunt</w:t>
+      </w:r>
+      <w:proofErr w:type="spellEnd"/>
+      <w:r>
+        <w:rPr>
+          <w:lang w:val="en-US"/>
+        </w:rPr>
+        <w:t xml:space="preserve"> </w:t>
+      </w:r>
+      <w:proofErr w:type="spellStart"/>
+      <w:r>
+        <w:rPr>
+          <w:lang w:val="en-US"/>
+        </w:rPr>
+        <w:t>mollit</w:t>
+      </w:r>
+      <w:proofErr w:type="spellEnd"/>
+      <w:r>
+        <w:rPr>
+          <w:lang w:val="en-US"/>
+        </w:rPr>
+        <w:t xml:space="preserve"> </w:t>
+      </w:r>
+      <w:proofErr w:type="spellStart"/>
+      <w:r>
+        <w:rPr>
+          <w:lang w:val="en-US"/>
+        </w:rPr>
+        <w:t>anim</w:t>
+      </w:r>
+      <w:proofErr w:type="spellEnd"/>
+      <w:r>
+        <w:rPr>
+          <w:lang w:val="en-US"/>
+        </w:rPr>
+        <w:t xml:space="preserve"> id </w:t>
+      </w:r>
+      <w:proofErr w:type="spellStart"/>
+      <w:r>
+        <w:rPr>
+          <w:lang w:val="en-US"/>
+        </w:rPr>
+        <w:t>est</w:t>
+      </w:r>
+      <w:proofErr w:type="spellEnd"/>
+      <w:r>
+        <w:rPr>
+          <w:lang w:val="en-US"/>
+        </w:rPr>
+        <w:t xml:space="preserve"> </w:t>
+      </w:r>
+      <w:proofErr w:type="spellStart"/>
+      <w:r>
+        <w:rPr>
+          <w:lang w:val="en-US"/>
+        </w:rPr>
+        <w:t>laborum</w:t>
+      </w:r>
+      <w:proofErr w:type="spellEnd"/>
+      <w:r>
+        <w:rPr>
+          <w:lang w:val="en-US"/>
+        </w:rPr>
+        <w:t>."</w:t>
       </w:r>
     </w:p>
     <w:p>
@@ -340,7 +993,7 @@
                     <pic:cNvPicPr preferRelativeResize="0"/>
                   </pic:nvPicPr>
                   <pic:blipFill>
-                    <a:blip r:embed="rId6"/>
+                    <a:blip r:embed="rId5"/>
                     <a:srcRect/>
                     <a:stretch>
                       <a:fillRect/>
@@ -381,7 +1034,147 @@
         <w:rPr>
           <w:lang w:val="en-US"/>
         </w:rPr>
-        <w:t xml:space="preserve">Lorem ipsum dolor sit amet, consectetur adipiscing elit, sed do eiusmod tempor incididunt ut labore et dolore magna aliqua. </w:t>
+        <w:t xml:space="preserve">Lorem ipsum dolor </w:t>
+      </w:r>
+      <w:proofErr w:type="gramStart"/>
+      <w:r>
+        <w:rPr>
+          <w:lang w:val="en-US"/>
+        </w:rPr>
+        <w:t>sit</w:t>
+      </w:r>
+      <w:proofErr w:type="gramEnd"/>
+      <w:r>
+        <w:rPr>
+          <w:lang w:val="en-US"/>
+        </w:rPr>
+        <w:t xml:space="preserve"> </w:t>
+      </w:r>
+      <w:proofErr w:type="spellStart"/>
+      <w:r>
+        <w:rPr>
+          <w:lang w:val="en-US"/>
+        </w:rPr>
+        <w:t>amet</w:t>
+      </w:r>
+      <w:proofErr w:type="spellEnd"/>
+      <w:r>
+        <w:rPr>
+          <w:lang w:val="en-US"/>
+        </w:rPr>
+        <w:t xml:space="preserve">, </w:t>
+      </w:r>
+      <w:proofErr w:type="spellStart"/>
+      <w:r>
+        <w:rPr>
+          <w:lang w:val="en-US"/>
+        </w:rPr>
+        <w:t>consectetur</w:t>
+      </w:r>
+      <w:proofErr w:type="spellEnd"/>
+      <w:r>
+        <w:rPr>
+          <w:lang w:val="en-US"/>
+        </w:rPr>
+        <w:t xml:space="preserve"> </w:t>
+      </w:r>
+      <w:proofErr w:type="spellStart"/>
+      <w:r>
+        <w:rPr>
+          <w:lang w:val="en-US"/>
+        </w:rPr>
+        <w:t>adipiscing</w:t>
+      </w:r>
+      <w:proofErr w:type="spellEnd"/>
+      <w:r>
+        <w:rPr>
+          <w:lang w:val="en-US"/>
+        </w:rPr>
+        <w:t xml:space="preserve"> </w:t>
+      </w:r>
+      <w:proofErr w:type="spellStart"/>
+      <w:r>
+        <w:rPr>
+          <w:lang w:val="en-US"/>
+        </w:rPr>
+        <w:t>elit</w:t>
+      </w:r>
+      <w:proofErr w:type="spellEnd"/>
+      <w:r>
+        <w:rPr>
+          <w:lang w:val="en-US"/>
+        </w:rPr>
+        <w:t xml:space="preserve">, sed do </w:t>
+      </w:r>
+      <w:proofErr w:type="spellStart"/>
+      <w:r>
+        <w:rPr>
+          <w:lang w:val="en-US"/>
+        </w:rPr>
+        <w:t>eiusmod</w:t>
+      </w:r>
+      <w:proofErr w:type="spellEnd"/>
+      <w:r>
+        <w:rPr>
+          <w:lang w:val="en-US"/>
+        </w:rPr>
+        <w:t xml:space="preserve"> </w:t>
+      </w:r>
+      <w:proofErr w:type="spellStart"/>
+      <w:r>
+        <w:rPr>
+          <w:lang w:val="en-US"/>
+        </w:rPr>
+        <w:t>tempor</w:t>
+      </w:r>
+      <w:proofErr w:type="spellEnd"/>
+      <w:r>
+        <w:rPr>
+          <w:lang w:val="en-US"/>
+        </w:rPr>
+        <w:t xml:space="preserve"> </w:t>
+      </w:r>
+      <w:proofErr w:type="spellStart"/>
+      <w:r>
+        <w:rPr>
+          <w:lang w:val="en-US"/>
+        </w:rPr>
+        <w:t>incididunt</w:t>
+      </w:r>
+      <w:proofErr w:type="spellEnd"/>
+      <w:r>
+        <w:rPr>
+          <w:lang w:val="en-US"/>
+        </w:rPr>
+        <w:t xml:space="preserve"> </w:t>
+      </w:r>
+      <w:proofErr w:type="spellStart"/>
+      <w:r>
+        <w:rPr>
+          <w:lang w:val="en-US"/>
+        </w:rPr>
+        <w:t>ut</w:t>
+      </w:r>
+      <w:proofErr w:type="spellEnd"/>
+      <w:r>
+        <w:rPr>
+          <w:lang w:val="en-US"/>
+        </w:rPr>
+        <w:t xml:space="preserve"> labore et dolore magna </w:t>
+      </w:r>
+      <w:proofErr w:type="spellStart"/>
+      <w:r>
+        <w:rPr>
+          <w:lang w:val="en-US"/>
+        </w:rPr>
+        <w:t>aliqua</w:t>
+      </w:r>
+      <w:proofErr w:type="spellEnd"/>
+      <w:r>
+        <w:rPr>
+          <w:lang w:val="en-US"/>
+        </w:rPr>
+        <w:t xml:space="preserve">. </w:t>
       </w:r>
       <w:r>
         <w:rPr>
@@ -393,7 +1186,315 @@
         <w:rPr>
           <w:lang w:val="en-US"/>
         </w:rPr>
-        <w:t>Duis aute irure dolor in reprehenderit in voluptate velit esse cillum dolore eu fugiat nulla pariatur. Excepteur sint occaecat cupidatat non proident, sunt in culpa qui officia deserunt mollit anim id est laborum.</w:t>
+        <w:t xml:space="preserve">Duis </w:t>
+      </w:r>
+      <w:proofErr w:type="spellStart"/>
+      <w:r>
+        <w:rPr>
+          <w:lang w:val="en-US"/>
+        </w:rPr>
+        <w:t>aute</w:t>
+      </w:r>
+      <w:proofErr w:type="spellEnd"/>
+      <w:r>
+        <w:rPr>
+          <w:lang w:val="en-US"/>
+        </w:rPr>
+        <w:t xml:space="preserve"> </w:t>
+      </w:r>
+      <w:proofErr w:type="spellStart"/>
+      <w:r>
+        <w:rPr>
+          <w:lang w:val="en-US"/>
+        </w:rPr>
+        <w:t>irure</w:t>
+      </w:r>
+      <w:proofErr w:type="spellEnd"/>
+      <w:r>
+        <w:rPr>
+          <w:lang w:val="en-US"/>
+        </w:rPr>
+        <w:t xml:space="preserve"> dolor in </w:t>
+      </w:r>
+      <w:proofErr w:type="spellStart"/>
+      <w:r>
+        <w:rPr>
+          <w:lang w:val="en-US"/>
+        </w:rPr>
+        <w:t>reprehenderit</w:t>
+      </w:r>
+      <w:proofErr w:type="spellEnd"/>
+      <w:r>
+        <w:rPr>
+          <w:lang w:val="en-US"/>
+        </w:rPr>
+        <w:t xml:space="preserve"> in </w:t>
+      </w:r>
+      <w:proofErr w:type="spellStart"/>
+      <w:r>
+        <w:rPr>
+          <w:lang w:val="en-US"/>
+        </w:rPr>
+        <w:t>voluptate</w:t>
+      </w:r>
+      <w:proofErr w:type="spellEnd"/>
+      <w:r>
+        <w:rPr>
+          <w:lang w:val="en-US"/>
+        </w:rPr>
+        <w:t xml:space="preserve"> </w:t>
+      </w:r>
+      <w:proofErr w:type="spellStart"/>
+      <w:r>
+        <w:rPr>
+          <w:lang w:val="en-US"/>
+        </w:rPr>
+        <w:t>velit</w:t>
+      </w:r>
+      <w:proofErr w:type="spellEnd"/>
+      <w:r>
+        <w:rPr>
+          <w:lang w:val="en-US"/>
+        </w:rPr>
+        <w:t xml:space="preserve"> </w:t>
+      </w:r>
+      <w:proofErr w:type="spellStart"/>
+      <w:r>
+        <w:rPr>
+          <w:lang w:val="en-US"/>
+        </w:rPr>
+        <w:t>esse</w:t>
+      </w:r>
+      <w:proofErr w:type="spellEnd"/>
+      <w:r>
+        <w:rPr>
+          <w:lang w:val="en-US"/>
+        </w:rPr>
+        <w:t xml:space="preserve"> </w:t>
+      </w:r>
+      <w:proofErr w:type="spellStart"/>
+      <w:r>
+        <w:rPr>
+          <w:lang w:val="en-US"/>
+        </w:rPr>
+        <w:t>cillum</w:t>
+      </w:r>
+      <w:proofErr w:type="spellEnd"/>
+      <w:r>
+        <w:rPr>
+          <w:lang w:val="en-US"/>
+        </w:rPr>
+        <w:t xml:space="preserve"> dolore </w:t>
+      </w:r>
+      <w:proofErr w:type="spellStart"/>
+      <w:r>
+        <w:rPr>
+          <w:lang w:val="en-US"/>
+        </w:rPr>
+        <w:t>eu</w:t>
+      </w:r>
+      <w:proofErr w:type="spellEnd"/>
+      <w:r>
+        <w:rPr>
+          <w:lang w:val="en-US"/>
+        </w:rPr>
+        <w:t xml:space="preserve"> </w:t>
+      </w:r>
+      <w:proofErr w:type="spellStart"/>
+      <w:r>
+        <w:rPr>
+          <w:lang w:val="en-US"/>
+        </w:rPr>
+        <w:t>fugiat</w:t>
+      </w:r>
+      <w:proofErr w:type="spellEnd"/>
+      <w:r>
+        <w:rPr>
+          <w:lang w:val="en-US"/>
+        </w:rPr>
+        <w:t xml:space="preserve"> </w:t>
+      </w:r>
+      <w:proofErr w:type="spellStart"/>
+      <w:r>
+        <w:rPr>
+          <w:lang w:val="en-US"/>
+        </w:rPr>
+        <w:t>nulla</w:t>
+      </w:r>
+      <w:proofErr w:type="spellEnd"/>
+      <w:r>
+        <w:rPr>
+          <w:lang w:val="en-US"/>
+        </w:rPr>
+        <w:t xml:space="preserve"> </w:t>
+      </w:r>
+      <w:proofErr w:type="spellStart"/>
+      <w:r>
+        <w:rPr>
+          <w:lang w:val="en-US"/>
+        </w:rPr>
+        <w:t>pariatur</w:t>
+      </w:r>
+      <w:proofErr w:type="spellEnd"/>
+      <w:r>
+        <w:rPr>
+          <w:lang w:val="en-US"/>
+        </w:rPr>
+        <w:t xml:space="preserve">. </w:t>
+      </w:r>
+      <w:proofErr w:type="spellStart"/>
+      <w:r>
+        <w:rPr>
+          <w:lang w:val="en-US"/>
+        </w:rPr>
+        <w:t>Excepteur</w:t>
+      </w:r>
+      <w:proofErr w:type="spellEnd"/>
+      <w:r>
+        <w:rPr>
+          <w:lang w:val="en-US"/>
+        </w:rPr>
+        <w:t xml:space="preserve"> </w:t>
+      </w:r>
+      <w:proofErr w:type="spellStart"/>
+      <w:r>
+        <w:rPr>
+          <w:lang w:val="en-US"/>
+        </w:rPr>
+        <w:t>sint</w:t>
+      </w:r>
+      <w:proofErr w:type="spellEnd"/>
+      <w:r>
+        <w:rPr>
+          <w:lang w:val="en-US"/>
+        </w:rPr>
+        <w:t xml:space="preserve"> </w:t>
+      </w:r>
+      <w:proofErr w:type="spellStart"/>
+      <w:r>
+        <w:rPr>
+          <w:lang w:val="en-US"/>
+        </w:rPr>
+        <w:t>occaecat</w:t>
+      </w:r>
+      <w:proofErr w:type="spellEnd"/>
+      <w:r>
+        <w:rPr>
+          <w:lang w:val="en-US"/>
+        </w:rPr>
+        <w:t xml:space="preserve"> </w:t>
+      </w:r>
+      <w:proofErr w:type="spellStart"/>
+      <w:r>
+        <w:rPr>
+          <w:lang w:val="en-US"/>
+        </w:rPr>
+        <w:t>cupidatat</w:t>
+      </w:r>
+      <w:proofErr w:type="spellEnd"/>
+      <w:r>
+        <w:rPr>
+          <w:lang w:val="en-US"/>
+        </w:rPr>
+        <w:t xml:space="preserve"> non </w:t>
+      </w:r>
+      <w:proofErr w:type="spellStart"/>
+      <w:r>
+        <w:rPr>
+          <w:lang w:val="en-US"/>
+        </w:rPr>
+        <w:t>proident</w:t>
+      </w:r>
+      <w:proofErr w:type="spellEnd"/>
+      <w:r>
+        <w:rPr>
+          <w:lang w:val="en-US"/>
+        </w:rPr>
+        <w:t xml:space="preserve">, sunt in culpa qui </w:t>
+      </w:r>
+      <w:proofErr w:type="spellStart"/>
+      <w:r>
+        <w:rPr>
+          <w:lang w:val="en-US"/>
+        </w:rPr>
+        <w:t>officia</w:t>
+      </w:r>
+      <w:proofErr w:type="spellEnd"/>
+      <w:r>
+        <w:rPr>
+          <w:lang w:val="en-US"/>
+        </w:rPr>
+        <w:t xml:space="preserve"> </w:t>
+      </w:r>
+      <w:proofErr w:type="spellStart"/>
+      <w:r>
+        <w:rPr>
+          <w:lang w:val="en-US"/>
+        </w:rPr>
+        <w:t>deserunt</w:t>
+      </w:r>
+      <w:proofErr w:type="spellEnd"/>
+      <w:r>
+        <w:rPr>
+          <w:lang w:val="en-US"/>
+        </w:rPr>
+        <w:t xml:space="preserve"> </w:t>
+      </w:r>
+      <w:proofErr w:type="spellStart"/>
+      <w:r>
+        <w:rPr>
+          <w:lang w:val="en-US"/>
+        </w:rPr>
+        <w:t>mollit</w:t>
+      </w:r>
+      <w:proofErr w:type="spellEnd"/>
+      <w:r>
+        <w:rPr>
+          <w:lang w:val="en-US"/>
+        </w:rPr>
+        <w:t xml:space="preserve"> </w:t>
+      </w:r>
+      <w:proofErr w:type="spellStart"/>
+      <w:r>
+        <w:rPr>
+          <w:lang w:val="en-US"/>
+        </w:rPr>
+        <w:t>anim</w:t>
+      </w:r>
+      <w:proofErr w:type="spellEnd"/>
+      <w:r>
+        <w:rPr>
+          <w:lang w:val="en-US"/>
+        </w:rPr>
+        <w:t xml:space="preserve"> id </w:t>
+      </w:r>
+      <w:proofErr w:type="spellStart"/>
+      <w:r>
+        <w:rPr>
+          <w:lang w:val="en-US"/>
+        </w:rPr>
+        <w:t>est</w:t>
+      </w:r>
+      <w:proofErr w:type="spellEnd"/>
+      <w:r>
+        <w:rPr>
+          <w:lang w:val="en-US"/>
+        </w:rPr>
+        <w:t xml:space="preserve"> </w:t>
+      </w:r>
+      <w:proofErr w:type="spellStart"/>
+      <w:r>
+        <w:rPr>
+          <w:lang w:val="en-US"/>
+        </w:rPr>
+        <w:t>laborum</w:t>
+      </w:r>
+      <w:proofErr w:type="spellEnd"/>
+      <w:r>
+        <w:rPr>
+          <w:lang w:val="en-US"/>
+        </w:rPr>
+        <w:t>.</w:t>
       </w:r>
     </w:p>
     <w:p>
@@ -442,7 +1543,7 @@
                     <pic:cNvPicPr preferRelativeResize="0"/>
                   </pic:nvPicPr>
                   <pic:blipFill>
-                    <a:blip r:embed="rId6"/>
+                    <a:blip r:embed="rId5"/>
                     <a:srcRect/>
                     <a:stretch>
                       <a:fillRect/>
@@ -483,7 +1584,147 @@
         <w:rPr>
           <w:lang w:val="en-US"/>
         </w:rPr>
-        <w:t xml:space="preserve">Lorem ipsum dolor sit amet, consectetur adipiscing elit, sed do eiusmod tempor incididunt ut labore et dolore magna aliqua. </w:t>
+        <w:t xml:space="preserve">Lorem ipsum dolor </w:t>
+      </w:r>
+      <w:proofErr w:type="gramStart"/>
+      <w:r>
+        <w:rPr>
+          <w:lang w:val="en-US"/>
+        </w:rPr>
+        <w:t>sit</w:t>
+      </w:r>
+      <w:proofErr w:type="gramEnd"/>
+      <w:r>
+        <w:rPr>
+          <w:lang w:val="en-US"/>
+        </w:rPr>
+        <w:t xml:space="preserve"> </w:t>
+      </w:r>
+      <w:proofErr w:type="spellStart"/>
+      <w:r>
+        <w:rPr>
+          <w:lang w:val="en-US"/>
+        </w:rPr>
+        <w:t>amet</w:t>
+      </w:r>
+      <w:proofErr w:type="spellEnd"/>
+      <w:r>
+        <w:rPr>
+          <w:lang w:val="en-US"/>
+        </w:rPr>
+        <w:t xml:space="preserve">, </w:t>
+      </w:r>
+      <w:proofErr w:type="spellStart"/>
+      <w:r>
+        <w:rPr>
+          <w:lang w:val="en-US"/>
+        </w:rPr>
+        <w:t>consectetur</w:t>
+      </w:r>
+      <w:proofErr w:type="spellEnd"/>
+      <w:r>
+        <w:rPr>
+          <w:lang w:val="en-US"/>
+        </w:rPr>
+        <w:t xml:space="preserve"> </w:t>
+      </w:r>
+      <w:proofErr w:type="spellStart"/>
+      <w:r>
+        <w:rPr>
+          <w:lang w:val="en-US"/>
+        </w:rPr>
+        <w:t>adipiscing</w:t>
+      </w:r>
+      <w:proofErr w:type="spellEnd"/>
+      <w:r>
+        <w:rPr>
+          <w:lang w:val="en-US"/>
+        </w:rPr>
+        <w:t xml:space="preserve"> </w:t>
+      </w:r>
+      <w:proofErr w:type="spellStart"/>
+      <w:r>
+        <w:rPr>
+          <w:lang w:val="en-US"/>
+        </w:rPr>
+        <w:t>elit</w:t>
+      </w:r>
+      <w:proofErr w:type="spellEnd"/>
+      <w:r>
+        <w:rPr>
+          <w:lang w:val="en-US"/>
+        </w:rPr>
+        <w:t xml:space="preserve">, sed do </w:t>
+      </w:r>
+      <w:proofErr w:type="spellStart"/>
+      <w:r>
+        <w:rPr>
+          <w:lang w:val="en-US"/>
+        </w:rPr>
+        <w:t>eiusmod</w:t>
+      </w:r>
+      <w:proofErr w:type="spellEnd"/>
+      <w:r>
+        <w:rPr>
+          <w:lang w:val="en-US"/>
+        </w:rPr>
+        <w:t xml:space="preserve"> </w:t>
+      </w:r>
+      <w:proofErr w:type="spellStart"/>
+      <w:r>
+        <w:rPr>
+          <w:lang w:val="en-US"/>
+        </w:rPr>
+        <w:t>tempor</w:t>
+      </w:r>
+      <w:proofErr w:type="spellEnd"/>
+      <w:r>
+        <w:rPr>
+          <w:lang w:val="en-US"/>
+        </w:rPr>
+        <w:t xml:space="preserve"> </w:t>
+      </w:r>
+      <w:proofErr w:type="spellStart"/>
+      <w:r>
+        <w:rPr>
+          <w:lang w:val="en-US"/>
+        </w:rPr>
+        <w:t>incididunt</w:t>
+      </w:r>
+      <w:proofErr w:type="spellEnd"/>
+      <w:r>
+        <w:rPr>
+          <w:lang w:val="en-US"/>
+        </w:rPr>
+        <w:t xml:space="preserve"> </w:t>
+      </w:r>
+      <w:proofErr w:type="spellStart"/>
+      <w:r>
+        <w:rPr>
+          <w:lang w:val="en-US"/>
+        </w:rPr>
+        <w:t>ut</w:t>
+      </w:r>
+      <w:proofErr w:type="spellEnd"/>
+      <w:r>
+        <w:rPr>
+          <w:lang w:val="en-US"/>
+        </w:rPr>
+        <w:t xml:space="preserve"> labore et dolore magna </w:t>
+      </w:r>
+      <w:proofErr w:type="spellStart"/>
+      <w:r>
+        <w:rPr>
+          <w:lang w:val="en-US"/>
+        </w:rPr>
+        <w:t>aliqua</w:t>
+      </w:r>
+      <w:proofErr w:type="spellEnd"/>
+      <w:r>
+        <w:rPr>
+          <w:lang w:val="en-US"/>
+        </w:rPr>
+        <w:t xml:space="preserve">. </w:t>
       </w:r>
       <w:r>
         <w:rPr>
@@ -495,7 +1736,315 @@
         <w:rPr>
           <w:lang w:val="en-US"/>
         </w:rPr>
-        <w:t>Duis aute irure dolor in reprehenderit in voluptate velit esse cillum dolore eu fugiat nulla pariatur. Excepteur sint occaecat cupidatat non proident, sunt in culpa qui officia deserunt mollit anim id est laborum.</w:t>
+        <w:t xml:space="preserve">Duis </w:t>
+      </w:r>
+      <w:proofErr w:type="spellStart"/>
+      <w:r>
+        <w:rPr>
+          <w:lang w:val="en-US"/>
+        </w:rPr>
+        <w:t>aute</w:t>
+      </w:r>
+      <w:proofErr w:type="spellEnd"/>
+      <w:r>
+        <w:rPr>
+          <w:lang w:val="en-US"/>
+        </w:rPr>
+        <w:t xml:space="preserve"> </w:t>
+      </w:r>
+      <w:proofErr w:type="spellStart"/>
+      <w:r>
+        <w:rPr>
+          <w:lang w:val="en-US"/>
+        </w:rPr>
+        <w:t>irure</w:t>
+      </w:r>
+      <w:proofErr w:type="spellEnd"/>
+      <w:r>
+        <w:rPr>
+          <w:lang w:val="en-US"/>
+        </w:rPr>
+        <w:t xml:space="preserve"> dolor in </w:t>
+      </w:r>
+      <w:proofErr w:type="spellStart"/>
+      <w:r>
+        <w:rPr>
+          <w:lang w:val="en-US"/>
+        </w:rPr>
+        <w:t>reprehenderit</w:t>
+      </w:r>
+      <w:proofErr w:type="spellEnd"/>
+      <w:r>
+        <w:rPr>
+          <w:lang w:val="en-US"/>
+        </w:rPr>
+        <w:t xml:space="preserve"> in </w:t>
+      </w:r>
+      <w:proofErr w:type="spellStart"/>
+      <w:r>
+        <w:rPr>
+          <w:lang w:val="en-US"/>
+        </w:rPr>
+        <w:t>voluptate</w:t>
+      </w:r>
+      <w:proofErr w:type="spellEnd"/>
+      <w:r>
+        <w:rPr>
+          <w:lang w:val="en-US"/>
+        </w:rPr>
+        <w:t xml:space="preserve"> </w:t>
+      </w:r>
+      <w:proofErr w:type="spellStart"/>
+      <w:r>
+        <w:rPr>
+          <w:lang w:val="en-US"/>
+        </w:rPr>
+        <w:t>velit</w:t>
+      </w:r>
+      <w:proofErr w:type="spellEnd"/>
+      <w:r>
+        <w:rPr>
+          <w:lang w:val="en-US"/>
+        </w:rPr>
+        <w:t xml:space="preserve"> </w:t>
+      </w:r>
+      <w:proofErr w:type="spellStart"/>
+      <w:r>
+        <w:rPr>
+          <w:lang w:val="en-US"/>
+        </w:rPr>
+        <w:t>esse</w:t>
+      </w:r>
+      <w:proofErr w:type="spellEnd"/>
+      <w:r>
+        <w:rPr>
+          <w:lang w:val="en-US"/>
+        </w:rPr>
+        <w:t xml:space="preserve"> </w:t>
+      </w:r>
+      <w:proofErr w:type="spellStart"/>
+      <w:r>
+        <w:rPr>
+          <w:lang w:val="en-US"/>
+        </w:rPr>
+        <w:t>cillum</w:t>
+      </w:r>
+      <w:proofErr w:type="spellEnd"/>
+      <w:r>
+        <w:rPr>
+          <w:lang w:val="en-US"/>
+        </w:rPr>
+        <w:t xml:space="preserve"> dolore </w:t>
+      </w:r>
+      <w:proofErr w:type="spellStart"/>
+      <w:r>
+        <w:rPr>
+          <w:lang w:val="en-US"/>
+        </w:rPr>
+        <w:t>eu</w:t>
+      </w:r>
+      <w:proofErr w:type="spellEnd"/>
+      <w:r>
+        <w:rPr>
+          <w:lang w:val="en-US"/>
+        </w:rPr>
+        <w:t xml:space="preserve"> </w:t>
+      </w:r>
+      <w:proofErr w:type="spellStart"/>
+      <w:r>
+        <w:rPr>
+          <w:lang w:val="en-US"/>
+        </w:rPr>
+        <w:t>fugiat</w:t>
+      </w:r>
+      <w:proofErr w:type="spellEnd"/>
+      <w:r>
+        <w:rPr>
+          <w:lang w:val="en-US"/>
+        </w:rPr>
+        <w:t xml:space="preserve"> </w:t>
+      </w:r>
+      <w:proofErr w:type="spellStart"/>
+      <w:r>
+        <w:rPr>
+          <w:lang w:val="en-US"/>
+        </w:rPr>
+        <w:t>nulla</w:t>
+      </w:r>
+      <w:proofErr w:type="spellEnd"/>
+      <w:r>
+        <w:rPr>
+          <w:lang w:val="en-US"/>
+        </w:rPr>
+        <w:t xml:space="preserve"> </w:t>
+      </w:r>
+      <w:proofErr w:type="spellStart"/>
+      <w:r>
+        <w:rPr>
+          <w:lang w:val="en-US"/>
+        </w:rPr>
+        <w:t>pariatur</w:t>
+      </w:r>
+      <w:proofErr w:type="spellEnd"/>
+      <w:r>
+        <w:rPr>
+          <w:lang w:val="en-US"/>
+        </w:rPr>
+        <w:t xml:space="preserve">. </w:t>
+      </w:r>
+      <w:proofErr w:type="spellStart"/>
+      <w:r>
+        <w:rPr>
+          <w:lang w:val="en-US"/>
+        </w:rPr>
+        <w:t>Excepteur</w:t>
+      </w:r>
+      <w:proofErr w:type="spellEnd"/>
+      <w:r>
+        <w:rPr>
+          <w:lang w:val="en-US"/>
+        </w:rPr>
+        <w:t xml:space="preserve"> </w:t>
+      </w:r>
+      <w:proofErr w:type="spellStart"/>
+      <w:r>
+        <w:rPr>
+          <w:lang w:val="en-US"/>
+        </w:rPr>
+        <w:t>sint</w:t>
+      </w:r>
+      <w:proofErr w:type="spellEnd"/>
+      <w:r>
+        <w:rPr>
+          <w:lang w:val="en-US"/>
+        </w:rPr>
+        <w:t xml:space="preserve"> </w:t>
+      </w:r>
+      <w:proofErr w:type="spellStart"/>
+      <w:r>
+        <w:rPr>
+          <w:lang w:val="en-US"/>
+        </w:rPr>
+        <w:t>occaecat</w:t>
+      </w:r>
+      <w:proofErr w:type="spellEnd"/>
+      <w:r>
+        <w:rPr>
+          <w:lang w:val="en-US"/>
+        </w:rPr>
+        <w:t xml:space="preserve"> </w:t>
+      </w:r>
+      <w:proofErr w:type="spellStart"/>
+      <w:r>
+        <w:rPr>
+          <w:lang w:val="en-US"/>
+        </w:rPr>
+        <w:t>cupidatat</w:t>
+      </w:r>
+      <w:proofErr w:type="spellEnd"/>
+      <w:r>
+        <w:rPr>
+          <w:lang w:val="en-US"/>
+        </w:rPr>
+        <w:t xml:space="preserve"> non </w:t>
+      </w:r>
+      <w:proofErr w:type="spellStart"/>
+      <w:r>
+        <w:rPr>
+          <w:lang w:val="en-US"/>
+        </w:rPr>
+        <w:t>proident</w:t>
+      </w:r>
+      <w:proofErr w:type="spellEnd"/>
+      <w:r>
+        <w:rPr>
+          <w:lang w:val="en-US"/>
+        </w:rPr>
+        <w:t xml:space="preserve">, sunt in culpa qui </w:t>
+      </w:r>
+      <w:proofErr w:type="spellStart"/>
+      <w:r>
+        <w:rPr>
+          <w:lang w:val="en-US"/>
+        </w:rPr>
+        <w:t>officia</w:t>
+      </w:r>
+      <w:proofErr w:type="spellEnd"/>
+      <w:r>
+        <w:rPr>
+          <w:lang w:val="en-US"/>
+        </w:rPr>
+        <w:t xml:space="preserve"> </w:t>
+      </w:r>
+      <w:proofErr w:type="spellStart"/>
+      <w:r>
+        <w:rPr>
+          <w:lang w:val="en-US"/>
+        </w:rPr>
+        <w:t>deserunt</w:t>
+      </w:r>
+      <w:proofErr w:type="spellEnd"/>
+      <w:r>
+        <w:rPr>
+          <w:lang w:val="en-US"/>
+        </w:rPr>
+        <w:t xml:space="preserve"> </w:t>
+      </w:r>
+      <w:proofErr w:type="spellStart"/>
+      <w:r>
+        <w:rPr>
+          <w:lang w:val="en-US"/>
+        </w:rPr>
+        <w:t>mollit</w:t>
+      </w:r>
+      <w:proofErr w:type="spellEnd"/>
+      <w:r>
+        <w:rPr>
+          <w:lang w:val="en-US"/>
+        </w:rPr>
+        <w:t xml:space="preserve"> </w:t>
+      </w:r>
+      <w:proofErr w:type="spellStart"/>
+      <w:r>
+        <w:rPr>
+          <w:lang w:val="en-US"/>
+        </w:rPr>
+        <w:t>anim</w:t>
+      </w:r>
+      <w:proofErr w:type="spellEnd"/>
+      <w:r>
+        <w:rPr>
+          <w:lang w:val="en-US"/>
+        </w:rPr>
+        <w:t xml:space="preserve"> id </w:t>
+      </w:r>
+      <w:proofErr w:type="spellStart"/>
+      <w:r>
+        <w:rPr>
+          <w:lang w:val="en-US"/>
+        </w:rPr>
+        <w:t>est</w:t>
+      </w:r>
+      <w:proofErr w:type="spellEnd"/>
+      <w:r>
+        <w:rPr>
+          <w:lang w:val="en-US"/>
+        </w:rPr>
+        <w:t xml:space="preserve"> </w:t>
+      </w:r>
+      <w:proofErr w:type="spellStart"/>
+      <w:r>
+        <w:rPr>
+          <w:lang w:val="en-US"/>
+        </w:rPr>
+        <w:t>laborum</w:t>
+      </w:r>
+      <w:proofErr w:type="spellEnd"/>
+      <w:r>
+        <w:rPr>
+          <w:lang w:val="en-US"/>
+        </w:rPr>
+        <w:t>.</w:t>
       </w:r>
     </w:p>
     <w:p>
@@ -542,7 +2091,7 @@
                     <pic:cNvPicPr preferRelativeResize="0"/>
                   </pic:nvPicPr>
                   <pic:blipFill>
-                    <a:blip r:embed="rId6"/>
+                    <a:blip r:embed="rId5"/>
                     <a:srcRect/>
                     <a:stretch>
                       <a:fillRect/>
@@ -583,7 +2132,147 @@
         <w:rPr>
           <w:lang w:val="en-US"/>
         </w:rPr>
-        <w:t xml:space="preserve">Lorem ipsum dolor sit amet, consectetur adipiscing elit, sed do eiusmod tempor incididunt ut labore et dolore magna aliqua. </w:t>
+        <w:t xml:space="preserve">Lorem ipsum dolor </w:t>
+      </w:r>
+      <w:proofErr w:type="gramStart"/>
+      <w:r>
+        <w:rPr>
+          <w:lang w:val="en-US"/>
+        </w:rPr>
+        <w:t>sit</w:t>
+      </w:r>
+      <w:proofErr w:type="gramEnd"/>
+      <w:r>
+        <w:rPr>
+          <w:lang w:val="en-US"/>
+        </w:rPr>
+        <w:t xml:space="preserve"> </w:t>
+      </w:r>
+      <w:proofErr w:type="spellStart"/>
+      <w:r>
+        <w:rPr>
+          <w:lang w:val="en-US"/>
+        </w:rPr>
+        <w:t>amet</w:t>
+      </w:r>
+      <w:proofErr w:type="spellEnd"/>
+      <w:r>
+        <w:rPr>
+          <w:lang w:val="en-US"/>
+        </w:rPr>
+        <w:t xml:space="preserve">, </w:t>
+      </w:r>
+      <w:proofErr w:type="spellStart"/>
+      <w:r>
+        <w:rPr>
+          <w:lang w:val="en-US"/>
+        </w:rPr>
+        <w:t>consectetur</w:t>
+      </w:r>
+      <w:proofErr w:type="spellEnd"/>
+      <w:r>
+        <w:rPr>
+          <w:lang w:val="en-US"/>
+        </w:rPr>
+        <w:t xml:space="preserve"> </w:t>
+      </w:r>
+      <w:proofErr w:type="spellStart"/>
+      <w:r>
+        <w:rPr>
+          <w:lang w:val="en-US"/>
+        </w:rPr>
+        <w:t>adipiscing</w:t>
+      </w:r>
+      <w:proofErr w:type="spellEnd"/>
+      <w:r>
+        <w:rPr>
+          <w:lang w:val="en-US"/>
+        </w:rPr>
+        <w:t xml:space="preserve"> </w:t>
+      </w:r>
+      <w:proofErr w:type="spellStart"/>
+      <w:r>
+        <w:rPr>
+          <w:lang w:val="en-US"/>
+        </w:rPr>
+        <w:t>elit</w:t>
+      </w:r>
+      <w:proofErr w:type="spellEnd"/>
+      <w:r>
+        <w:rPr>
+          <w:lang w:val="en-US"/>
+        </w:rPr>
+        <w:t xml:space="preserve">, sed do </w:t>
+      </w:r>
+      <w:proofErr w:type="spellStart"/>
+      <w:r>
+        <w:rPr>
+          <w:lang w:val="en-US"/>
+        </w:rPr>
+        <w:t>eiusmod</w:t>
+      </w:r>
+      <w:proofErr w:type="spellEnd"/>
+      <w:r>
+        <w:rPr>
+          <w:lang w:val="en-US"/>
+        </w:rPr>
+        <w:t xml:space="preserve"> </w:t>
+      </w:r>
+      <w:proofErr w:type="spellStart"/>
+      <w:r>
+        <w:rPr>
+          <w:lang w:val="en-US"/>
+        </w:rPr>
+        <w:t>tempor</w:t>
+      </w:r>
+      <w:proofErr w:type="spellEnd"/>
+      <w:r>
+        <w:rPr>
+          <w:lang w:val="en-US"/>
+        </w:rPr>
+        <w:t xml:space="preserve"> </w:t>
+      </w:r>
+      <w:proofErr w:type="spellStart"/>
+      <w:r>
+        <w:rPr>
+          <w:lang w:val="en-US"/>
+        </w:rPr>
+        <w:t>incididunt</w:t>
+      </w:r>
+      <w:proofErr w:type="spellEnd"/>
+      <w:r>
+        <w:rPr>
+          <w:lang w:val="en-US"/>
+        </w:rPr>
+        <w:t xml:space="preserve"> </w:t>
+      </w:r>
+      <w:proofErr w:type="spellStart"/>
+      <w:r>
+        <w:rPr>
+          <w:lang w:val="en-US"/>
+        </w:rPr>
+        <w:t>ut</w:t>
+      </w:r>
+      <w:proofErr w:type="spellEnd"/>
+      <w:r>
+        <w:rPr>
+          <w:lang w:val="en-US"/>
+        </w:rPr>
+        <w:t xml:space="preserve"> labore et dolore magna </w:t>
+      </w:r>
+      <w:proofErr w:type="spellStart"/>
+      <w:r>
+        <w:rPr>
+          <w:lang w:val="en-US"/>
+        </w:rPr>
+        <w:t>aliqua</w:t>
+      </w:r>
+      <w:proofErr w:type="spellEnd"/>
+      <w:r>
+        <w:rPr>
+          <w:lang w:val="en-US"/>
+        </w:rPr>
+        <w:t xml:space="preserve">. </w:t>
       </w:r>
       <w:r>
         <w:rPr>
@@ -595,7 +2284,315 @@
         <w:rPr>
           <w:lang w:val="en-US"/>
         </w:rPr>
-        <w:t>Duis aute irure dolor in reprehenderit in voluptate velit esse cillum dolore eu fugiat nulla pariatur. Excepteur sint occaecat cupidatat non proident, sunt in culpa qui officia deserunt mollit anim id est laborum.</w:t>
+        <w:t xml:space="preserve">Duis </w:t>
+      </w:r>
+      <w:proofErr w:type="spellStart"/>
+      <w:r>
+        <w:rPr>
+          <w:lang w:val="en-US"/>
+        </w:rPr>
+        <w:t>aute</w:t>
+      </w:r>
+      <w:proofErr w:type="spellEnd"/>
+      <w:r>
+        <w:rPr>
+          <w:lang w:val="en-US"/>
+        </w:rPr>
+        <w:t xml:space="preserve"> </w:t>
+      </w:r>
+      <w:proofErr w:type="spellStart"/>
+      <w:r>
+        <w:rPr>
+          <w:lang w:val="en-US"/>
+        </w:rPr>
+        <w:t>irure</w:t>
+      </w:r>
+      <w:proofErr w:type="spellEnd"/>
+      <w:r>
+        <w:rPr>
+          <w:lang w:val="en-US"/>
+        </w:rPr>
+        <w:t xml:space="preserve"> dolor in </w:t>
+      </w:r>
+      <w:proofErr w:type="spellStart"/>
+      <w:r>
+        <w:rPr>
+          <w:lang w:val="en-US"/>
+        </w:rPr>
+        <w:t>reprehenderit</w:t>
+      </w:r>
+      <w:proofErr w:type="spellEnd"/>
+      <w:r>
+        <w:rPr>
+          <w:lang w:val="en-US"/>
+        </w:rPr>
+        <w:t xml:space="preserve"> in </w:t>
+      </w:r>
+      <w:proofErr w:type="spellStart"/>
+      <w:r>
+        <w:rPr>
+          <w:lang w:val="en-US"/>
+        </w:rPr>
+        <w:t>voluptate</w:t>
+      </w:r>
+      <w:proofErr w:type="spellEnd"/>
+      <w:r>
+        <w:rPr>
+          <w:lang w:val="en-US"/>
+        </w:rPr>
+        <w:t xml:space="preserve"> </w:t>
+      </w:r>
+      <w:proofErr w:type="spellStart"/>
+      <w:r>
+        <w:rPr>
+          <w:lang w:val="en-US"/>
+        </w:rPr>
+        <w:t>velit</w:t>
+      </w:r>
+      <w:proofErr w:type="spellEnd"/>
+      <w:r>
+        <w:rPr>
+          <w:lang w:val="en-US"/>
+        </w:rPr>
+        <w:t xml:space="preserve"> </w:t>
+      </w:r>
+      <w:proofErr w:type="spellStart"/>
+      <w:r>
+        <w:rPr>
+          <w:lang w:val="en-US"/>
+        </w:rPr>
+        <w:t>esse</w:t>
+      </w:r>
+      <w:proofErr w:type="spellEnd"/>
+      <w:r>
+        <w:rPr>
+          <w:lang w:val="en-US"/>
+        </w:rPr>
+        <w:t xml:space="preserve"> </w:t>
+      </w:r>
+      <w:proofErr w:type="spellStart"/>
+      <w:r>
+        <w:rPr>
+          <w:lang w:val="en-US"/>
+        </w:rPr>
+        <w:t>cillum</w:t>
+      </w:r>
+      <w:proofErr w:type="spellEnd"/>
+      <w:r>
+        <w:rPr>
+          <w:lang w:val="en-US"/>
+        </w:rPr>
+        <w:t xml:space="preserve"> dolore </w:t>
+      </w:r>
+      <w:proofErr w:type="spellStart"/>
+      <w:r>
+        <w:rPr>
+          <w:lang w:val="en-US"/>
+        </w:rPr>
+        <w:t>eu</w:t>
+      </w:r>
+      <w:proofErr w:type="spellEnd"/>
+      <w:r>
+        <w:rPr>
+          <w:lang w:val="en-US"/>
+        </w:rPr>
+        <w:t xml:space="preserve"> </w:t>
+      </w:r>
+      <w:proofErr w:type="spellStart"/>
+      <w:r>
+        <w:rPr>
+          <w:lang w:val="en-US"/>
+        </w:rPr>
+        <w:t>fugiat</w:t>
+      </w:r>
+      <w:proofErr w:type="spellEnd"/>
+      <w:r>
+        <w:rPr>
+          <w:lang w:val="en-US"/>
+        </w:rPr>
+        <w:t xml:space="preserve"> </w:t>
+      </w:r>
+      <w:proofErr w:type="spellStart"/>
+      <w:r>
+        <w:rPr>
+          <w:lang w:val="en-US"/>
+        </w:rPr>
+        <w:t>nulla</w:t>
+      </w:r>
+      <w:proofErr w:type="spellEnd"/>
+      <w:r>
+        <w:rPr>
+          <w:lang w:val="en-US"/>
+        </w:rPr>
+        <w:t xml:space="preserve"> </w:t>
+      </w:r>
+      <w:proofErr w:type="spellStart"/>
+      <w:r>
+        <w:rPr>
+          <w:lang w:val="en-US"/>
+        </w:rPr>
+        <w:t>pariatur</w:t>
+      </w:r>
+      <w:proofErr w:type="spellEnd"/>
+      <w:r>
+        <w:rPr>
+          <w:lang w:val="en-US"/>
+        </w:rPr>
+        <w:t xml:space="preserve">. </w:t>
+      </w:r>
+      <w:proofErr w:type="spellStart"/>
+      <w:r>
+        <w:rPr>
+          <w:lang w:val="en-US"/>
+        </w:rPr>
+        <w:t>Excepteur</w:t>
+      </w:r>
+      <w:proofErr w:type="spellEnd"/>
+      <w:r>
+        <w:rPr>
+          <w:lang w:val="en-US"/>
+        </w:rPr>
+        <w:t xml:space="preserve"> </w:t>
+      </w:r>
+      <w:proofErr w:type="spellStart"/>
+      <w:r>
+        <w:rPr>
+          <w:lang w:val="en-US"/>
+        </w:rPr>
+        <w:t>sint</w:t>
+      </w:r>
+      <w:proofErr w:type="spellEnd"/>
+      <w:r>
+        <w:rPr>
+          <w:lang w:val="en-US"/>
+        </w:rPr>
+        <w:t xml:space="preserve"> </w:t>
+      </w:r>
+      <w:proofErr w:type="spellStart"/>
+      <w:r>
+        <w:rPr>
+          <w:lang w:val="en-US"/>
+        </w:rPr>
+        <w:t>occaecat</w:t>
+      </w:r>
+      <w:proofErr w:type="spellEnd"/>
+      <w:r>
+        <w:rPr>
+          <w:lang w:val="en-US"/>
+        </w:rPr>
+        <w:t xml:space="preserve"> </w:t>
+      </w:r>
+      <w:proofErr w:type="spellStart"/>
+      <w:r>
+        <w:rPr>
+          <w:lang w:val="en-US"/>
+        </w:rPr>
+        <w:t>cupidatat</w:t>
+      </w:r>
+      <w:proofErr w:type="spellEnd"/>
+      <w:r>
+        <w:rPr>
+          <w:lang w:val="en-US"/>
+        </w:rPr>
+        <w:t xml:space="preserve"> non </w:t>
+      </w:r>
+      <w:proofErr w:type="spellStart"/>
+      <w:r>
+        <w:rPr>
+          <w:lang w:val="en-US"/>
+        </w:rPr>
+        <w:t>proident</w:t>
+      </w:r>
+      <w:proofErr w:type="spellEnd"/>
+      <w:r>
+        <w:rPr>
+          <w:lang w:val="en-US"/>
+        </w:rPr>
+        <w:t xml:space="preserve">, sunt in culpa qui </w:t>
+      </w:r>
+      <w:proofErr w:type="spellStart"/>
+      <w:r>
+        <w:rPr>
+          <w:lang w:val="en-US"/>
+        </w:rPr>
+        <w:t>officia</w:t>
+      </w:r>
+      <w:proofErr w:type="spellEnd"/>
+      <w:r>
+        <w:rPr>
+          <w:lang w:val="en-US"/>
+        </w:rPr>
+        <w:t xml:space="preserve"> </w:t>
+      </w:r>
+      <w:proofErr w:type="spellStart"/>
+      <w:r>
+        <w:rPr>
+          <w:lang w:val="en-US"/>
+        </w:rPr>
+        <w:t>deserunt</w:t>
+      </w:r>
+      <w:proofErr w:type="spellEnd"/>
+      <w:r>
+        <w:rPr>
+          <w:lang w:val="en-US"/>
+        </w:rPr>
+        <w:t xml:space="preserve"> </w:t>
+      </w:r>
+      <w:proofErr w:type="spellStart"/>
+      <w:r>
+        <w:rPr>
+          <w:lang w:val="en-US"/>
+        </w:rPr>
+        <w:t>mollit</w:t>
+      </w:r>
+      <w:proofErr w:type="spellEnd"/>
+      <w:r>
+        <w:rPr>
+          <w:lang w:val="en-US"/>
+        </w:rPr>
+        <w:t xml:space="preserve"> </w:t>
+      </w:r>
+      <w:proofErr w:type="spellStart"/>
+      <w:r>
+        <w:rPr>
+          <w:lang w:val="en-US"/>
+        </w:rPr>
+        <w:t>anim</w:t>
+      </w:r>
+      <w:proofErr w:type="spellEnd"/>
+      <w:r>
+        <w:rPr>
+          <w:lang w:val="en-US"/>
+        </w:rPr>
+        <w:t xml:space="preserve"> id </w:t>
+      </w:r>
+      <w:proofErr w:type="spellStart"/>
+      <w:r>
+        <w:rPr>
+          <w:lang w:val="en-US"/>
+        </w:rPr>
+        <w:t>est</w:t>
+      </w:r>
+      <w:proofErr w:type="spellEnd"/>
+      <w:r>
+        <w:rPr>
+          <w:lang w:val="en-US"/>
+        </w:rPr>
+        <w:t xml:space="preserve"> </w:t>
+      </w:r>
+      <w:proofErr w:type="spellStart"/>
+      <w:r>
+        <w:rPr>
+          <w:lang w:val="en-US"/>
+        </w:rPr>
+        <w:t>laborum</w:t>
+      </w:r>
+      <w:proofErr w:type="spellEnd"/>
+      <w:r>
+        <w:rPr>
+          <w:lang w:val="en-US"/>
+        </w:rPr>
+        <w:t>.</w:t>
       </w:r>
     </w:p>
     <w:p>
@@ -651,7 +2648,7 @@
                     <pic:cNvPicPr preferRelativeResize="0"/>
                   </pic:nvPicPr>
                   <pic:blipFill>
-                    <a:blip r:embed="rId6"/>
+                    <a:blip r:embed="rId5"/>
                     <a:srcRect/>
                     <a:stretch>
                       <a:fillRect/>
@@ -692,7 +2689,609 @@
         <w:rPr>
           <w:lang w:val="en-US"/>
         </w:rPr>
-        <w:t>Lorem ipsum dolor sit amet, consectetur adipiscing elit, sed do eiusmod tempor incididunt ut labore et dolore magna aliqua. Ut enim ad minim veniam, quis nostrud exercitation ullamco laboris nisi ut aliquip ex ea commodo consequat. Duis aute irure dolor in reprehenderit in voluptate velit esse cillum dolore eu fugiat nulla pariatur. Excepteur sint occaecat cupidatat non proident, sunt in culpa qui officia deserunt mollit anim id est laborum.</w:t>
+        <w:t xml:space="preserve">Lorem ipsum dolor </w:t>
+      </w:r>
+      <w:proofErr w:type="gramStart"/>
+      <w:r>
+        <w:rPr>
+          <w:lang w:val="en-US"/>
+        </w:rPr>
+        <w:t>sit</w:t>
+      </w:r>
+      <w:proofErr w:type="gramEnd"/>
+      <w:r>
+        <w:rPr>
+          <w:lang w:val="en-US"/>
+        </w:rPr>
+        <w:t xml:space="preserve"> </w:t>
+      </w:r>
+      <w:proofErr w:type="spellStart"/>
+      <w:r>
+        <w:rPr>
+          <w:lang w:val="en-US"/>
+        </w:rPr>
+        <w:t>amet</w:t>
+      </w:r>
+      <w:proofErr w:type="spellEnd"/>
+      <w:r>
+        <w:rPr>
+          <w:lang w:val="en-US"/>
+        </w:rPr>
+        <w:t xml:space="preserve">, </w:t>
+      </w:r>
+      <w:proofErr w:type="spellStart"/>
+      <w:r>
+        <w:rPr>
+          <w:lang w:val="en-US"/>
+        </w:rPr>
+        <w:t>consectetur</w:t>
+      </w:r>
+      <w:proofErr w:type="spellEnd"/>
+      <w:r>
+        <w:rPr>
+          <w:lang w:val="en-US"/>
+        </w:rPr>
+        <w:t xml:space="preserve"> </w:t>
+      </w:r>
+      <w:proofErr w:type="spellStart"/>
+      <w:r>
+        <w:rPr>
+          <w:lang w:val="en-US"/>
+        </w:rPr>
+        <w:t>adipiscing</w:t>
+      </w:r>
+      <w:proofErr w:type="spellEnd"/>
+      <w:r>
+        <w:rPr>
+          <w:lang w:val="en-US"/>
+        </w:rPr>
+        <w:t xml:space="preserve"> </w:t>
+      </w:r>
+      <w:proofErr w:type="spellStart"/>
+      <w:r>
+        <w:rPr>
+          <w:lang w:val="en-US"/>
+        </w:rPr>
+        <w:t>elit</w:t>
+      </w:r>
+      <w:proofErr w:type="spellEnd"/>
+      <w:r>
+        <w:rPr>
+          <w:lang w:val="en-US"/>
+        </w:rPr>
+        <w:t xml:space="preserve">, sed do </w:t>
+      </w:r>
+      <w:proofErr w:type="spellStart"/>
+      <w:r>
+        <w:rPr>
+          <w:lang w:val="en-US"/>
+        </w:rPr>
+        <w:t>eiusmod</w:t>
+      </w:r>
+      <w:proofErr w:type="spellEnd"/>
+      <w:r>
+        <w:rPr>
+          <w:lang w:val="en-US"/>
+        </w:rPr>
+        <w:t xml:space="preserve"> </w:t>
+      </w:r>
+      <w:proofErr w:type="spellStart"/>
+      <w:r>
+        <w:rPr>
+          <w:lang w:val="en-US"/>
+        </w:rPr>
+        <w:t>tempor</w:t>
+      </w:r>
+      <w:proofErr w:type="spellEnd"/>
+      <w:r>
+        <w:rPr>
+          <w:lang w:val="en-US"/>
+        </w:rPr>
+        <w:t xml:space="preserve"> </w:t>
+      </w:r>
+      <w:proofErr w:type="spellStart"/>
+      <w:r>
+        <w:rPr>
+          <w:lang w:val="en-US"/>
+        </w:rPr>
+        <w:t>incididunt</w:t>
+      </w:r>
+      <w:proofErr w:type="spellEnd"/>
+      <w:r>
+        <w:rPr>
+          <w:lang w:val="en-US"/>
+        </w:rPr>
+        <w:t xml:space="preserve"> </w:t>
+      </w:r>
+      <w:proofErr w:type="spellStart"/>
+      <w:r>
+        <w:rPr>
+          <w:lang w:val="en-US"/>
+        </w:rPr>
+        <w:t>ut</w:t>
+      </w:r>
+      <w:proofErr w:type="spellEnd"/>
+      <w:r>
+        <w:rPr>
+          <w:lang w:val="en-US"/>
+        </w:rPr>
+        <w:t xml:space="preserve"> labore et dolore magna </w:t>
+      </w:r>
+      <w:proofErr w:type="spellStart"/>
+      <w:r>
+        <w:rPr>
+          <w:lang w:val="en-US"/>
+        </w:rPr>
+        <w:t>aliqua</w:t>
+      </w:r>
+      <w:proofErr w:type="spellEnd"/>
+      <w:r>
+        <w:rPr>
+          <w:lang w:val="en-US"/>
+        </w:rPr>
+        <w:t xml:space="preserve">. Ut </w:t>
+      </w:r>
+      <w:proofErr w:type="spellStart"/>
+      <w:r>
+        <w:rPr>
+          <w:lang w:val="en-US"/>
+        </w:rPr>
+        <w:t>enim</w:t>
+      </w:r>
+      <w:proofErr w:type="spellEnd"/>
+      <w:r>
+        <w:rPr>
+          <w:lang w:val="en-US"/>
+        </w:rPr>
+        <w:t xml:space="preserve"> ad minim </w:t>
+      </w:r>
+      <w:proofErr w:type="spellStart"/>
+      <w:r>
+        <w:rPr>
+          <w:lang w:val="en-US"/>
+        </w:rPr>
+        <w:t>veniam</w:t>
+      </w:r>
+      <w:proofErr w:type="spellEnd"/>
+      <w:r>
+        <w:rPr>
+          <w:lang w:val="en-US"/>
+        </w:rPr>
+        <w:t xml:space="preserve">, </w:t>
+      </w:r>
+      <w:proofErr w:type="spellStart"/>
+      <w:r>
+        <w:rPr>
+          <w:lang w:val="en-US"/>
+        </w:rPr>
+        <w:t>quis</w:t>
+      </w:r>
+      <w:proofErr w:type="spellEnd"/>
+      <w:r>
+        <w:rPr>
+          <w:lang w:val="en-US"/>
+        </w:rPr>
+        <w:t xml:space="preserve"> </w:t>
+      </w:r>
+      <w:proofErr w:type="spellStart"/>
+      <w:r>
+        <w:rPr>
+          <w:lang w:val="en-US"/>
+        </w:rPr>
+        <w:t>nostrud</w:t>
+      </w:r>
+      <w:proofErr w:type="spellEnd"/>
+      <w:r>
+        <w:rPr>
+          <w:lang w:val="en-US"/>
+        </w:rPr>
+        <w:t xml:space="preserve"> exercitation </w:t>
+      </w:r>
+      <w:proofErr w:type="spellStart"/>
+      <w:r>
+        <w:rPr>
+          <w:lang w:val="en-US"/>
+        </w:rPr>
+        <w:t>ullamco</w:t>
+      </w:r>
+      <w:proofErr w:type="spellEnd"/>
+      <w:r>
+        <w:rPr>
+          <w:lang w:val="en-US"/>
+        </w:rPr>
+        <w:t xml:space="preserve"> </w:t>
+      </w:r>
+      <w:proofErr w:type="spellStart"/>
+      <w:r>
+        <w:rPr>
+          <w:lang w:val="en-US"/>
+        </w:rPr>
+        <w:t>laboris</w:t>
+      </w:r>
+      <w:proofErr w:type="spellEnd"/>
+      <w:r>
+        <w:rPr>
+          <w:lang w:val="en-US"/>
+        </w:rPr>
+        <w:t xml:space="preserve"> nisi </w:t>
+      </w:r>
+      <w:proofErr w:type="spellStart"/>
+      <w:r>
+        <w:rPr>
+          <w:lang w:val="en-US"/>
+        </w:rPr>
+        <w:t>ut</w:t>
+      </w:r>
+      <w:proofErr w:type="spellEnd"/>
+      <w:r>
+        <w:rPr>
+          <w:lang w:val="en-US"/>
+        </w:rPr>
+        <w:t xml:space="preserve"> </w:t>
+      </w:r>
+      <w:proofErr w:type="spellStart"/>
+      <w:r>
+        <w:rPr>
+          <w:lang w:val="en-US"/>
+        </w:rPr>
+        <w:t>aliquip</w:t>
+      </w:r>
+      <w:proofErr w:type="spellEnd"/>
+      <w:r>
+        <w:rPr>
+          <w:lang w:val="en-US"/>
+        </w:rPr>
+        <w:t xml:space="preserve"> ex </w:t>
+      </w:r>
+      <w:proofErr w:type="spellStart"/>
+      <w:r>
+        <w:rPr>
+          <w:lang w:val="en-US"/>
+        </w:rPr>
+        <w:t>ea</w:t>
+      </w:r>
+      <w:proofErr w:type="spellEnd"/>
+      <w:r>
+        <w:rPr>
+          <w:lang w:val="en-US"/>
+        </w:rPr>
+        <w:t xml:space="preserve"> </w:t>
+      </w:r>
+      <w:proofErr w:type="spellStart"/>
+      <w:r>
+        <w:rPr>
+          <w:lang w:val="en-US"/>
+        </w:rPr>
+        <w:t>commodo</w:t>
+      </w:r>
+      <w:proofErr w:type="spellEnd"/>
+      <w:r>
+        <w:rPr>
+          <w:lang w:val="en-US"/>
+        </w:rPr>
+        <w:t xml:space="preserve"> </w:t>
+      </w:r>
+      <w:proofErr w:type="spellStart"/>
+      <w:r>
+        <w:rPr>
+          <w:lang w:val="en-US"/>
+        </w:rPr>
+        <w:t>consequat</w:t>
+      </w:r>
+      <w:proofErr w:type="spellEnd"/>
+      <w:r>
+        <w:rPr>
+          <w:lang w:val="en-US"/>
+        </w:rPr>
+        <w:t xml:space="preserve">. Duis </w:t>
+      </w:r>
+      <w:proofErr w:type="spellStart"/>
+      <w:r>
+        <w:rPr>
+          <w:lang w:val="en-US"/>
+        </w:rPr>
+        <w:t>aute</w:t>
+      </w:r>
+      <w:proofErr w:type="spellEnd"/>
+      <w:r>
+        <w:rPr>
+          <w:lang w:val="en-US"/>
+        </w:rPr>
+        <w:t xml:space="preserve"> </w:t>
+      </w:r>
+      <w:proofErr w:type="spellStart"/>
+      <w:r>
+        <w:rPr>
+          <w:lang w:val="en-US"/>
+        </w:rPr>
+        <w:t>irure</w:t>
+      </w:r>
+      <w:proofErr w:type="spellEnd"/>
+      <w:r>
+        <w:rPr>
+          <w:lang w:val="en-US"/>
+        </w:rPr>
+        <w:t xml:space="preserve"> dolor in </w:t>
+      </w:r>
+      <w:proofErr w:type="spellStart"/>
+      <w:r>
+        <w:rPr>
+          <w:lang w:val="en-US"/>
+        </w:rPr>
+        <w:t>reprehenderit</w:t>
+      </w:r>
+      <w:proofErr w:type="spellEnd"/>
+      <w:r>
+        <w:rPr>
+          <w:lang w:val="en-US"/>
+        </w:rPr>
+        <w:t xml:space="preserve"> in </w:t>
+      </w:r>
+      <w:proofErr w:type="spellStart"/>
+      <w:r>
+        <w:rPr>
+          <w:lang w:val="en-US"/>
+        </w:rPr>
+        <w:t>voluptate</w:t>
+      </w:r>
+      <w:proofErr w:type="spellEnd"/>
+      <w:r>
+        <w:rPr>
+          <w:lang w:val="en-US"/>
+        </w:rPr>
+        <w:t xml:space="preserve"> </w:t>
+      </w:r>
+      <w:proofErr w:type="spellStart"/>
+      <w:r>
+        <w:rPr>
+          <w:lang w:val="en-US"/>
+        </w:rPr>
+        <w:t>velit</w:t>
+      </w:r>
+      <w:proofErr w:type="spellEnd"/>
+      <w:r>
+        <w:rPr>
+          <w:lang w:val="en-US"/>
+        </w:rPr>
+        <w:t xml:space="preserve"> </w:t>
+      </w:r>
+      <w:proofErr w:type="spellStart"/>
+      <w:r>
+        <w:rPr>
+          <w:lang w:val="en-US"/>
+        </w:rPr>
+        <w:t>esse</w:t>
+      </w:r>
+      <w:proofErr w:type="spellEnd"/>
+      <w:r>
+        <w:rPr>
+          <w:lang w:val="en-US"/>
+        </w:rPr>
+        <w:t xml:space="preserve"> </w:t>
+      </w:r>
+      <w:proofErr w:type="spellStart"/>
+      <w:r>
+        <w:rPr>
+          <w:lang w:val="en-US"/>
+        </w:rPr>
+        <w:t>cillum</w:t>
+      </w:r>
+      <w:proofErr w:type="spellEnd"/>
+      <w:r>
+        <w:rPr>
+          <w:lang w:val="en-US"/>
+        </w:rPr>
+        <w:t xml:space="preserve"> dolore </w:t>
+      </w:r>
+      <w:proofErr w:type="spellStart"/>
+      <w:r>
+        <w:rPr>
+          <w:lang w:val="en-US"/>
+        </w:rPr>
+        <w:t>eu</w:t>
+      </w:r>
+      <w:proofErr w:type="spellEnd"/>
+      <w:r>
+        <w:rPr>
+          <w:lang w:val="en-US"/>
+        </w:rPr>
+        <w:t xml:space="preserve"> </w:t>
+      </w:r>
+      <w:proofErr w:type="spellStart"/>
+      <w:r>
+        <w:rPr>
+          <w:lang w:val="en-US"/>
+        </w:rPr>
+        <w:t>fugiat</w:t>
+      </w:r>
+      <w:proofErr w:type="spellEnd"/>
+      <w:r>
+        <w:rPr>
+          <w:lang w:val="en-US"/>
+        </w:rPr>
+        <w:t xml:space="preserve"> </w:t>
+      </w:r>
+      <w:proofErr w:type="spellStart"/>
+      <w:r>
+        <w:rPr>
+          <w:lang w:val="en-US"/>
+        </w:rPr>
+        <w:t>nulla</w:t>
+      </w:r>
+      <w:proofErr w:type="spellEnd"/>
+      <w:r>
+        <w:rPr>
+          <w:lang w:val="en-US"/>
+        </w:rPr>
+        <w:t xml:space="preserve"> </w:t>
+      </w:r>
+      <w:proofErr w:type="spellStart"/>
+      <w:r>
+        <w:rPr>
+          <w:lang w:val="en-US"/>
+        </w:rPr>
+        <w:t>pariatur</w:t>
+      </w:r>
+      <w:proofErr w:type="spellEnd"/>
+      <w:r>
+        <w:rPr>
+          <w:lang w:val="en-US"/>
+        </w:rPr>
+        <w:t xml:space="preserve">. </w:t>
+      </w:r>
+      <w:proofErr w:type="spellStart"/>
+      <w:r>
+        <w:rPr>
+          <w:lang w:val="en-US"/>
+        </w:rPr>
+        <w:t>Excepteur</w:t>
+      </w:r>
+      <w:proofErr w:type="spellEnd"/>
+      <w:r>
+        <w:rPr>
+          <w:lang w:val="en-US"/>
+        </w:rPr>
+        <w:t xml:space="preserve"> </w:t>
+      </w:r>
+      <w:proofErr w:type="spellStart"/>
+      <w:r>
+        <w:rPr>
+          <w:lang w:val="en-US"/>
+        </w:rPr>
+        <w:t>sint</w:t>
+      </w:r>
+      <w:proofErr w:type="spellEnd"/>
+      <w:r>
+        <w:rPr>
+          <w:lang w:val="en-US"/>
+        </w:rPr>
+        <w:t xml:space="preserve"> </w:t>
+      </w:r>
+      <w:proofErr w:type="spellStart"/>
+      <w:r>
+        <w:rPr>
+          <w:lang w:val="en-US"/>
+        </w:rPr>
+        <w:t>occaecat</w:t>
+      </w:r>
+      <w:proofErr w:type="spellEnd"/>
+      <w:r>
+        <w:rPr>
+          <w:lang w:val="en-US"/>
+        </w:rPr>
+        <w:t xml:space="preserve"> </w:t>
+      </w:r>
+      <w:proofErr w:type="spellStart"/>
+      <w:r>
+        <w:rPr>
+          <w:lang w:val="en-US"/>
+        </w:rPr>
+        <w:t>cupidatat</w:t>
+      </w:r>
+      <w:proofErr w:type="spellEnd"/>
+      <w:r>
+        <w:rPr>
+          <w:lang w:val="en-US"/>
+        </w:rPr>
+        <w:t xml:space="preserve"> non </w:t>
+      </w:r>
+      <w:proofErr w:type="spellStart"/>
+      <w:r>
+        <w:rPr>
+          <w:lang w:val="en-US"/>
+        </w:rPr>
+        <w:t>proident</w:t>
+      </w:r>
+      <w:proofErr w:type="spellEnd"/>
+      <w:r>
+        <w:rPr>
+          <w:lang w:val="en-US"/>
+        </w:rPr>
+        <w:t xml:space="preserve">, sunt in culpa qui </w:t>
+      </w:r>
+      <w:proofErr w:type="spellStart"/>
+      <w:r>
+        <w:rPr>
+          <w:lang w:val="en-US"/>
+        </w:rPr>
+        <w:t>officia</w:t>
+      </w:r>
+      <w:proofErr w:type="spellEnd"/>
+      <w:r>
+        <w:rPr>
+          <w:lang w:val="en-US"/>
+        </w:rPr>
+        <w:t xml:space="preserve"> </w:t>
+      </w:r>
+      <w:proofErr w:type="spellStart"/>
+      <w:r>
+        <w:rPr>
+          <w:lang w:val="en-US"/>
+        </w:rPr>
+        <w:t>deserunt</w:t>
+      </w:r>
+      <w:proofErr w:type="spellEnd"/>
+      <w:r>
+        <w:rPr>
+          <w:lang w:val="en-US"/>
+        </w:rPr>
+        <w:t xml:space="preserve"> </w:t>
+      </w:r>
+      <w:proofErr w:type="spellStart"/>
+      <w:r>
+        <w:rPr>
+          <w:lang w:val="en-US"/>
+        </w:rPr>
+        <w:t>mollit</w:t>
+      </w:r>
+      <w:proofErr w:type="spellEnd"/>
+      <w:r>
+        <w:rPr>
+          <w:lang w:val="en-US"/>
+        </w:rPr>
+        <w:t xml:space="preserve"> </w:t>
+      </w:r>
+      <w:proofErr w:type="spellStart"/>
+      <w:r>
+        <w:rPr>
+          <w:lang w:val="en-US"/>
+        </w:rPr>
+        <w:t>anim</w:t>
+      </w:r>
+      <w:proofErr w:type="spellEnd"/>
+      <w:r>
+        <w:rPr>
+          <w:lang w:val="en-US"/>
+        </w:rPr>
+        <w:t xml:space="preserve"> id </w:t>
+      </w:r>
+      <w:proofErr w:type="spellStart"/>
+      <w:r>
+        <w:rPr>
+          <w:lang w:val="en-US"/>
+        </w:rPr>
+        <w:t>est</w:t>
+      </w:r>
+      <w:proofErr w:type="spellEnd"/>
+      <w:r>
+        <w:rPr>
+          <w:lang w:val="en-US"/>
+        </w:rPr>
+        <w:t xml:space="preserve"> </w:t>
+      </w:r>
+      <w:proofErr w:type="spellStart"/>
+      <w:r>
+        <w:rPr>
+          <w:lang w:val="en-US"/>
+        </w:rPr>
+        <w:t>laborum</w:t>
+      </w:r>
+      <w:proofErr w:type="spellEnd"/>
+      <w:r>
+        <w:rPr>
+          <w:lang w:val="en-US"/>
+        </w:rPr>
+        <w:t>.</w:t>
       </w:r>
     </w:p>
     <w:p/>
@@ -719,7 +3318,7 @@
                     <pic:cNvPicPr preferRelativeResize="0"/>
                   </pic:nvPicPr>
                   <pic:blipFill>
-                    <a:blip r:embed="rId6"/>
+                    <a:blip r:embed="rId5"/>
                     <a:srcRect/>
                     <a:stretch>
                       <a:fillRect/>
@@ -760,7 +3359,609 @@
         <w:rPr>
           <w:lang w:val="en-US"/>
         </w:rPr>
-        <w:t>Lorem ipsum dolor sit amet, consectetur adipiscing elit, sed do eiusmod tempor incididunt ut labore et dolore magna aliqua. Ut enim ad minim veniam, quis nostrud exercitation ullamco laboris nisi ut aliquip ex ea commodo consequat. Duis aute irure dolor in reprehenderit in voluptate velit esse cillum dolore eu fugiat nulla pariatur. Excepteur sint occaecat cupidatat non proident, sunt in culpa qui officia deserunt mollit anim id est laborum.</w:t>
+        <w:t xml:space="preserve">Lorem ipsum dolor </w:t>
+      </w:r>
+      <w:proofErr w:type="gramStart"/>
+      <w:r>
+        <w:rPr>
+          <w:lang w:val="en-US"/>
+        </w:rPr>
+        <w:t>sit</w:t>
+      </w:r>
+      <w:proofErr w:type="gramEnd"/>
+      <w:r>
+        <w:rPr>
+          <w:lang w:val="en-US"/>
+        </w:rPr>
+        <w:t xml:space="preserve"> </w:t>
+      </w:r>
+      <w:proofErr w:type="spellStart"/>
+      <w:r>
+        <w:rPr>
+          <w:lang w:val="en-US"/>
+        </w:rPr>
+        <w:t>amet</w:t>
+      </w:r>
+      <w:proofErr w:type="spellEnd"/>
+      <w:r>
+        <w:rPr>
+          <w:lang w:val="en-US"/>
+        </w:rPr>
+        <w:t xml:space="preserve">, </w:t>
+      </w:r>
+      <w:proofErr w:type="spellStart"/>
+      <w:r>
+        <w:rPr>
+          <w:lang w:val="en-US"/>
+        </w:rPr>
+        <w:t>consectetur</w:t>
+      </w:r>
+      <w:proofErr w:type="spellEnd"/>
+      <w:r>
+        <w:rPr>
+          <w:lang w:val="en-US"/>
+        </w:rPr>
+        <w:t xml:space="preserve"> </w:t>
+      </w:r>
+      <w:proofErr w:type="spellStart"/>
+      <w:r>
+        <w:rPr>
+          <w:lang w:val="en-US"/>
+        </w:rPr>
+        <w:t>adipiscing</w:t>
+      </w:r>
+      <w:proofErr w:type="spellEnd"/>
+      <w:r>
+        <w:rPr>
+          <w:lang w:val="en-US"/>
+        </w:rPr>
+        <w:t xml:space="preserve"> </w:t>
+      </w:r>
+      <w:proofErr w:type="spellStart"/>
+      <w:r>
+        <w:rPr>
+          <w:lang w:val="en-US"/>
+        </w:rPr>
+        <w:t>elit</w:t>
+      </w:r>
+      <w:proofErr w:type="spellEnd"/>
+      <w:r>
+        <w:rPr>
+          <w:lang w:val="en-US"/>
+        </w:rPr>
+        <w:t xml:space="preserve">, sed do </w:t>
+      </w:r>
+      <w:proofErr w:type="spellStart"/>
+      <w:r>
+        <w:rPr>
+          <w:lang w:val="en-US"/>
+        </w:rPr>
+        <w:t>eiusmod</w:t>
+      </w:r>
+      <w:proofErr w:type="spellEnd"/>
+      <w:r>
+        <w:rPr>
+          <w:lang w:val="en-US"/>
+        </w:rPr>
+        <w:t xml:space="preserve"> </w:t>
+      </w:r>
+      <w:proofErr w:type="spellStart"/>
+      <w:r>
+        <w:rPr>
+          <w:lang w:val="en-US"/>
+        </w:rPr>
+        <w:t>tempor</w:t>
+      </w:r>
+      <w:proofErr w:type="spellEnd"/>
+      <w:r>
+        <w:rPr>
+          <w:lang w:val="en-US"/>
+        </w:rPr>
+        <w:t xml:space="preserve"> </w:t>
+      </w:r>
+      <w:proofErr w:type="spellStart"/>
+      <w:r>
+        <w:rPr>
+          <w:lang w:val="en-US"/>
+        </w:rPr>
+        <w:t>incididunt</w:t>
+      </w:r>
+      <w:proofErr w:type="spellEnd"/>
+      <w:r>
+        <w:rPr>
+          <w:lang w:val="en-US"/>
+        </w:rPr>
+        <w:t xml:space="preserve"> </w:t>
+      </w:r>
+      <w:proofErr w:type="spellStart"/>
+      <w:r>
+        <w:rPr>
+          <w:lang w:val="en-US"/>
+        </w:rPr>
+        <w:t>ut</w:t>
+      </w:r>
+      <w:proofErr w:type="spellEnd"/>
+      <w:r>
+        <w:rPr>
+          <w:lang w:val="en-US"/>
+        </w:rPr>
+        <w:t xml:space="preserve"> labore et dolore magna </w:t>
+      </w:r>
+      <w:proofErr w:type="spellStart"/>
+      <w:r>
+        <w:rPr>
+          <w:lang w:val="en-US"/>
+        </w:rPr>
+        <w:t>aliqua</w:t>
+      </w:r>
+      <w:proofErr w:type="spellEnd"/>
+      <w:r>
+        <w:rPr>
+          <w:lang w:val="en-US"/>
+        </w:rPr>
+        <w:t xml:space="preserve">. Ut </w:t>
+      </w:r>
+      <w:proofErr w:type="spellStart"/>
+      <w:r>
+        <w:rPr>
+          <w:lang w:val="en-US"/>
+        </w:rPr>
+        <w:t>enim</w:t>
+      </w:r>
+      <w:proofErr w:type="spellEnd"/>
+      <w:r>
+        <w:rPr>
+          <w:lang w:val="en-US"/>
+        </w:rPr>
+        <w:t xml:space="preserve"> ad minim </w:t>
+      </w:r>
+      <w:proofErr w:type="spellStart"/>
+      <w:r>
+        <w:rPr>
+          <w:lang w:val="en-US"/>
+        </w:rPr>
+        <w:t>veniam</w:t>
+      </w:r>
+      <w:proofErr w:type="spellEnd"/>
+      <w:r>
+        <w:rPr>
+          <w:lang w:val="en-US"/>
+        </w:rPr>
+        <w:t xml:space="preserve">, </w:t>
+      </w:r>
+      <w:proofErr w:type="spellStart"/>
+      <w:r>
+        <w:rPr>
+          <w:lang w:val="en-US"/>
+        </w:rPr>
+        <w:t>quis</w:t>
+      </w:r>
+      <w:proofErr w:type="spellEnd"/>
+      <w:r>
+        <w:rPr>
+          <w:lang w:val="en-US"/>
+        </w:rPr>
+        <w:t xml:space="preserve"> </w:t>
+      </w:r>
+      <w:proofErr w:type="spellStart"/>
+      <w:r>
+        <w:rPr>
+          <w:lang w:val="en-US"/>
+        </w:rPr>
+        <w:t>nostrud</w:t>
+      </w:r>
+      <w:proofErr w:type="spellEnd"/>
+      <w:r>
+        <w:rPr>
+          <w:lang w:val="en-US"/>
+        </w:rPr>
+        <w:t xml:space="preserve"> exercitation </w:t>
+      </w:r>
+      <w:proofErr w:type="spellStart"/>
+      <w:r>
+        <w:rPr>
+          <w:lang w:val="en-US"/>
+        </w:rPr>
+        <w:t>ullamco</w:t>
+      </w:r>
+      <w:proofErr w:type="spellEnd"/>
+      <w:r>
+        <w:rPr>
+          <w:lang w:val="en-US"/>
+        </w:rPr>
+        <w:t xml:space="preserve"> </w:t>
+      </w:r>
+      <w:proofErr w:type="spellStart"/>
+      <w:r>
+        <w:rPr>
+          <w:lang w:val="en-US"/>
+        </w:rPr>
+        <w:t>laboris</w:t>
+      </w:r>
+      <w:proofErr w:type="spellEnd"/>
+      <w:r>
+        <w:rPr>
+          <w:lang w:val="en-US"/>
+        </w:rPr>
+        <w:t xml:space="preserve"> nisi </w:t>
+      </w:r>
+      <w:proofErr w:type="spellStart"/>
+      <w:r>
+        <w:rPr>
+          <w:lang w:val="en-US"/>
+        </w:rPr>
+        <w:t>ut</w:t>
+      </w:r>
+      <w:proofErr w:type="spellEnd"/>
+      <w:r>
+        <w:rPr>
+          <w:lang w:val="en-US"/>
+        </w:rPr>
+        <w:t xml:space="preserve"> </w:t>
+      </w:r>
+      <w:proofErr w:type="spellStart"/>
+      <w:r>
+        <w:rPr>
+          <w:lang w:val="en-US"/>
+        </w:rPr>
+        <w:t>aliquip</w:t>
+      </w:r>
+      <w:proofErr w:type="spellEnd"/>
+      <w:r>
+        <w:rPr>
+          <w:lang w:val="en-US"/>
+        </w:rPr>
+        <w:t xml:space="preserve"> ex </w:t>
+      </w:r>
+      <w:proofErr w:type="spellStart"/>
+      <w:r>
+        <w:rPr>
+          <w:lang w:val="en-US"/>
+        </w:rPr>
+        <w:t>ea</w:t>
+      </w:r>
+      <w:proofErr w:type="spellEnd"/>
+      <w:r>
+        <w:rPr>
+          <w:lang w:val="en-US"/>
+        </w:rPr>
+        <w:t xml:space="preserve"> </w:t>
+      </w:r>
+      <w:proofErr w:type="spellStart"/>
+      <w:r>
+        <w:rPr>
+          <w:lang w:val="en-US"/>
+        </w:rPr>
+        <w:t>commodo</w:t>
+      </w:r>
+      <w:proofErr w:type="spellEnd"/>
+      <w:r>
+        <w:rPr>
+          <w:lang w:val="en-US"/>
+        </w:rPr>
+        <w:t xml:space="preserve"> </w:t>
+      </w:r>
+      <w:proofErr w:type="spellStart"/>
+      <w:r>
+        <w:rPr>
+          <w:lang w:val="en-US"/>
+        </w:rPr>
+        <w:t>consequat</w:t>
+      </w:r>
+      <w:proofErr w:type="spellEnd"/>
+      <w:r>
+        <w:rPr>
+          <w:lang w:val="en-US"/>
+        </w:rPr>
+        <w:t xml:space="preserve">. Duis </w:t>
+      </w:r>
+      <w:proofErr w:type="spellStart"/>
+      <w:r>
+        <w:rPr>
+          <w:lang w:val="en-US"/>
+        </w:rPr>
+        <w:t>aute</w:t>
+      </w:r>
+      <w:proofErr w:type="spellEnd"/>
+      <w:r>
+        <w:rPr>
+          <w:lang w:val="en-US"/>
+        </w:rPr>
+        <w:t xml:space="preserve"> </w:t>
+      </w:r>
+      <w:proofErr w:type="spellStart"/>
+      <w:r>
+        <w:rPr>
+          <w:lang w:val="en-US"/>
+        </w:rPr>
+        <w:t>irure</w:t>
+      </w:r>
+      <w:proofErr w:type="spellEnd"/>
+      <w:r>
+        <w:rPr>
+          <w:lang w:val="en-US"/>
+        </w:rPr>
+        <w:t xml:space="preserve"> dolor in </w:t>
+      </w:r>
+      <w:proofErr w:type="spellStart"/>
+      <w:r>
+        <w:rPr>
+          <w:lang w:val="en-US"/>
+        </w:rPr>
+        <w:t>reprehenderit</w:t>
+      </w:r>
+      <w:proofErr w:type="spellEnd"/>
+      <w:r>
+        <w:rPr>
+          <w:lang w:val="en-US"/>
+        </w:rPr>
+        <w:t xml:space="preserve"> in </w:t>
+      </w:r>
+      <w:proofErr w:type="spellStart"/>
+      <w:r>
+        <w:rPr>
+          <w:lang w:val="en-US"/>
+        </w:rPr>
+        <w:t>voluptate</w:t>
+      </w:r>
+      <w:proofErr w:type="spellEnd"/>
+      <w:r>
+        <w:rPr>
+          <w:lang w:val="en-US"/>
+        </w:rPr>
+        <w:t xml:space="preserve"> </w:t>
+      </w:r>
+      <w:proofErr w:type="spellStart"/>
+      <w:r>
+        <w:rPr>
+          <w:lang w:val="en-US"/>
+        </w:rPr>
+        <w:t>velit</w:t>
+      </w:r>
+      <w:proofErr w:type="spellEnd"/>
+      <w:r>
+        <w:rPr>
+          <w:lang w:val="en-US"/>
+        </w:rPr>
+        <w:t xml:space="preserve"> </w:t>
+      </w:r>
+      <w:proofErr w:type="spellStart"/>
+      <w:r>
+        <w:rPr>
+          <w:lang w:val="en-US"/>
+        </w:rPr>
+        <w:t>esse</w:t>
+      </w:r>
+      <w:proofErr w:type="spellEnd"/>
+      <w:r>
+        <w:rPr>
+          <w:lang w:val="en-US"/>
+        </w:rPr>
+        <w:t xml:space="preserve"> </w:t>
+      </w:r>
+      <w:proofErr w:type="spellStart"/>
+      <w:r>
+        <w:rPr>
+          <w:lang w:val="en-US"/>
+        </w:rPr>
+        <w:t>cillum</w:t>
+      </w:r>
+      <w:proofErr w:type="spellEnd"/>
+      <w:r>
+        <w:rPr>
+          <w:lang w:val="en-US"/>
+        </w:rPr>
+        <w:t xml:space="preserve"> dolore </w:t>
+      </w:r>
+      <w:proofErr w:type="spellStart"/>
+      <w:r>
+        <w:rPr>
+          <w:lang w:val="en-US"/>
+        </w:rPr>
+        <w:t>eu</w:t>
+      </w:r>
+      <w:proofErr w:type="spellEnd"/>
+      <w:r>
+        <w:rPr>
+          <w:lang w:val="en-US"/>
+        </w:rPr>
+        <w:t xml:space="preserve"> </w:t>
+      </w:r>
+      <w:proofErr w:type="spellStart"/>
+      <w:r>
+        <w:rPr>
+          <w:lang w:val="en-US"/>
+        </w:rPr>
+        <w:t>fugiat</w:t>
+      </w:r>
+      <w:proofErr w:type="spellEnd"/>
+      <w:r>
+        <w:rPr>
+          <w:lang w:val="en-US"/>
+        </w:rPr>
+        <w:t xml:space="preserve"> </w:t>
+      </w:r>
+      <w:proofErr w:type="spellStart"/>
+      <w:r>
+        <w:rPr>
+          <w:lang w:val="en-US"/>
+        </w:rPr>
+        <w:t>nulla</w:t>
+      </w:r>
+      <w:proofErr w:type="spellEnd"/>
+      <w:r>
+        <w:rPr>
+          <w:lang w:val="en-US"/>
+        </w:rPr>
+        <w:t xml:space="preserve"> </w:t>
+      </w:r>
+      <w:proofErr w:type="spellStart"/>
+      <w:r>
+        <w:rPr>
+          <w:lang w:val="en-US"/>
+        </w:rPr>
+        <w:t>pariatur</w:t>
+      </w:r>
+      <w:proofErr w:type="spellEnd"/>
+      <w:r>
+        <w:rPr>
+          <w:lang w:val="en-US"/>
+        </w:rPr>
+        <w:t xml:space="preserve">. </w:t>
+      </w:r>
+      <w:proofErr w:type="spellStart"/>
+      <w:r>
+        <w:rPr>
+          <w:lang w:val="en-US"/>
+        </w:rPr>
+        <w:t>Excepteur</w:t>
+      </w:r>
+      <w:proofErr w:type="spellEnd"/>
+      <w:r>
+        <w:rPr>
+          <w:lang w:val="en-US"/>
+        </w:rPr>
+        <w:t xml:space="preserve"> </w:t>
+      </w:r>
+      <w:proofErr w:type="spellStart"/>
+      <w:r>
+        <w:rPr>
+          <w:lang w:val="en-US"/>
+        </w:rPr>
+        <w:t>sint</w:t>
+      </w:r>
+      <w:proofErr w:type="spellEnd"/>
+      <w:r>
+        <w:rPr>
+          <w:lang w:val="en-US"/>
+        </w:rPr>
+        <w:t xml:space="preserve"> </w:t>
+      </w:r>
+      <w:proofErr w:type="spellStart"/>
+      <w:r>
+        <w:rPr>
+          <w:lang w:val="en-US"/>
+        </w:rPr>
+        <w:t>occaecat</w:t>
+      </w:r>
+      <w:proofErr w:type="spellEnd"/>
+      <w:r>
+        <w:rPr>
+          <w:lang w:val="en-US"/>
+        </w:rPr>
+        <w:t xml:space="preserve"> </w:t>
+      </w:r>
+      <w:proofErr w:type="spellStart"/>
+      <w:r>
+        <w:rPr>
+          <w:lang w:val="en-US"/>
+        </w:rPr>
+        <w:t>cupidatat</w:t>
+      </w:r>
+      <w:proofErr w:type="spellEnd"/>
+      <w:r>
+        <w:rPr>
+          <w:lang w:val="en-US"/>
+        </w:rPr>
+        <w:t xml:space="preserve"> non </w:t>
+      </w:r>
+      <w:proofErr w:type="spellStart"/>
+      <w:r>
+        <w:rPr>
+          <w:lang w:val="en-US"/>
+        </w:rPr>
+        <w:t>proident</w:t>
+      </w:r>
+      <w:proofErr w:type="spellEnd"/>
+      <w:r>
+        <w:rPr>
+          <w:lang w:val="en-US"/>
+        </w:rPr>
+        <w:t xml:space="preserve">, sunt in culpa qui </w:t>
+      </w:r>
+      <w:proofErr w:type="spellStart"/>
+      <w:r>
+        <w:rPr>
+          <w:lang w:val="en-US"/>
+        </w:rPr>
+        <w:t>officia</w:t>
+      </w:r>
+      <w:proofErr w:type="spellEnd"/>
+      <w:r>
+        <w:rPr>
+          <w:lang w:val="en-US"/>
+        </w:rPr>
+        <w:t xml:space="preserve"> </w:t>
+      </w:r>
+      <w:proofErr w:type="spellStart"/>
+      <w:r>
+        <w:rPr>
+          <w:lang w:val="en-US"/>
+        </w:rPr>
+        <w:t>deserunt</w:t>
+      </w:r>
+      <w:proofErr w:type="spellEnd"/>
+      <w:r>
+        <w:rPr>
+          <w:lang w:val="en-US"/>
+        </w:rPr>
+        <w:t xml:space="preserve"> </w:t>
+      </w:r>
+      <w:proofErr w:type="spellStart"/>
+      <w:r>
+        <w:rPr>
+          <w:lang w:val="en-US"/>
+        </w:rPr>
+        <w:t>mollit</w:t>
+      </w:r>
+      <w:proofErr w:type="spellEnd"/>
+      <w:r>
+        <w:rPr>
+          <w:lang w:val="en-US"/>
+        </w:rPr>
+        <w:t xml:space="preserve"> </w:t>
+      </w:r>
+      <w:proofErr w:type="spellStart"/>
+      <w:r>
+        <w:rPr>
+          <w:lang w:val="en-US"/>
+        </w:rPr>
+        <w:t>anim</w:t>
+      </w:r>
+      <w:proofErr w:type="spellEnd"/>
+      <w:r>
+        <w:rPr>
+          <w:lang w:val="en-US"/>
+        </w:rPr>
+        <w:t xml:space="preserve"> id </w:t>
+      </w:r>
+      <w:proofErr w:type="spellStart"/>
+      <w:r>
+        <w:rPr>
+          <w:lang w:val="en-US"/>
+        </w:rPr>
+        <w:t>est</w:t>
+      </w:r>
+      <w:proofErr w:type="spellEnd"/>
+      <w:r>
+        <w:rPr>
+          <w:lang w:val="en-US"/>
+        </w:rPr>
+        <w:t xml:space="preserve"> </w:t>
+      </w:r>
+      <w:proofErr w:type="spellStart"/>
+      <w:r>
+        <w:rPr>
+          <w:lang w:val="en-US"/>
+        </w:rPr>
+        <w:t>laborum</w:t>
+      </w:r>
+      <w:proofErr w:type="spellEnd"/>
+      <w:r>
+        <w:rPr>
+          <w:lang w:val="en-US"/>
+        </w:rPr>
+        <w:t>.</w:t>
       </w:r>
     </w:p>
     <w:p/>
@@ -1596,6 +4797,30 @@
       <w:u w:val="single"/>
     </w:rPr>
   </w:style>
+  <w:style w:type="character" w:styleId="UnresolvedMention">
+    <w:name w:val="Unresolved Mention"/>
+    <w:basedOn w:val="DefaultParagraphFont"/>
+    <w:uiPriority w:val="99"/>
+    <w:semiHidden/>
+    <w:unhideWhenUsed/>
+    <w:rsid w:val="009C4287"/>
+    <w:rPr>
+      <w:color w:val="605E5C"/>
+      <w:shd w:val="clear" w:color="auto" w:fill="E1DFDD"/>
+    </w:rPr>
+  </w:style>
+  <w:style w:type="character" w:styleId="FollowedHyperlink">
+    <w:name w:val="FollowedHyperlink"/>
+    <w:basedOn w:val="DefaultParagraphFont"/>
+    <w:uiPriority w:val="99"/>
+    <w:semiHidden/>
+    <w:unhideWhenUsed/>
+    <w:rsid w:val="00F34B64"/>
+    <w:rPr>
+      <w:color w:val="800080" w:themeColor="followedHyperlink"/>
+      <w:u w:val="single"/>
+    </w:rPr>
+  </w:style>
 </w:styles>
 </file>
 

</xml_diff>